<commit_message>
2023-03-20 End of day file push
</commit_message>
<xml_diff>
--- a/NVIS/Stargate/VIN Breakdown Cheatsheet.docx
+++ b/NVIS/Stargate/VIN Breakdown Cheatsheet.docx
@@ -727,14 +727,6 @@
                 <w:szCs w:val="20"/>
               </w:rPr>
             </w:pPr>
-            <w:r>
-              <w:rPr>
-                <w:rFonts w:ascii="Arial" w:hAnsi="Arial" w:cs="Arial"/>
-                <w:sz w:val="20"/>
-                <w:szCs w:val="20"/>
-              </w:rPr>
-              <w:t>Ball Type Pull</w:t>
-            </w:r>
           </w:p>
         </w:tc>
       </w:tr>
@@ -905,7 +897,12 @@
         <w:br w:type="page"/>
       </w:r>
     </w:p>
-    <w:p/>
+    <w:p>
+      <w:r>
+        <w:lastRenderedPageBreak/>
+        <w:t>2023-03-20 Old version:</w:t>
+      </w:r>
+    </w:p>
     <w:tbl>
       <w:tblPr>
         <w:tblStyle w:val="TableGrid"/>
@@ -1955,6 +1952,2369 @@
         </w:tc>
       </w:tr>
     </w:tbl>
+    <w:p/>
+    <w:p/>
+    <w:p/>
+    <w:p/>
+    <w:p/>
+    <w:p/>
+    <w:p/>
+    <w:p/>
+    <w:tbl>
+      <w:tblPr>
+        <w:tblW w:w="3255" w:type="dxa"/>
+        <w:tblInd w:w="93" w:type="dxa"/>
+        <w:tblLook w:val="04A0"/>
+      </w:tblPr>
+      <w:tblGrid>
+        <w:gridCol w:w="735"/>
+        <w:gridCol w:w="2520"/>
+      </w:tblGrid>
+      <w:tr>
+        <w:trPr>
+          <w:trHeight w:val="255"/>
+        </w:trPr>
+        <w:tc>
+          <w:tcPr>
+            <w:tcW w:w="735" w:type="dxa"/>
+            <w:tcBorders>
+              <w:top w:val="single" w:sz="4" w:space="0" w:color="auto"/>
+              <w:left w:val="single" w:sz="4" w:space="0" w:color="auto"/>
+              <w:bottom w:val="single" w:sz="4" w:space="0" w:color="auto"/>
+              <w:right w:val="single" w:sz="4" w:space="0" w:color="auto"/>
+            </w:tcBorders>
+            <w:shd w:val="clear" w:color="auto" w:fill="auto"/>
+            <w:noWrap/>
+            <w:vAlign w:val="bottom"/>
+            <w:hideMark/>
+          </w:tcPr>
+          <w:p>
+            <w:pPr>
+              <w:spacing w:after="0" w:line="240" w:lineRule="auto"/>
+              <w:rPr>
+                <w:rFonts w:ascii="Arial" w:eastAsia="Times New Roman" w:hAnsi="Arial" w:cs="Arial"/>
+                <w:sz w:val="20"/>
+                <w:szCs w:val="20"/>
+              </w:rPr>
+            </w:pPr>
+            <w:r>
+              <w:rPr>
+                <w:rFonts w:ascii="Arial" w:eastAsia="Times New Roman" w:hAnsi="Arial" w:cs="Arial"/>
+                <w:sz w:val="20"/>
+                <w:szCs w:val="20"/>
+              </w:rPr>
+              <w:t>Pos 6</w:t>
+            </w:r>
+          </w:p>
+        </w:tc>
+        <w:tc>
+          <w:tcPr>
+            <w:tcW w:w="2520" w:type="dxa"/>
+            <w:tcBorders>
+              <w:top w:val="single" w:sz="4" w:space="0" w:color="auto"/>
+              <w:left w:val="nil"/>
+              <w:bottom w:val="nil"/>
+              <w:right w:val="single" w:sz="4" w:space="0" w:color="auto"/>
+            </w:tcBorders>
+            <w:shd w:val="clear" w:color="auto" w:fill="auto"/>
+            <w:noWrap/>
+            <w:vAlign w:val="bottom"/>
+            <w:hideMark/>
+          </w:tcPr>
+          <w:p>
+            <w:pPr>
+              <w:spacing w:after="0" w:line="240" w:lineRule="auto"/>
+              <w:rPr>
+                <w:rFonts w:ascii="Arial" w:eastAsia="Times New Roman" w:hAnsi="Arial" w:cs="Arial"/>
+                <w:sz w:val="20"/>
+                <w:szCs w:val="20"/>
+              </w:rPr>
+            </w:pPr>
+            <w:r>
+              <w:rPr>
+                <w:rFonts w:ascii="Arial" w:eastAsia="Times New Roman" w:hAnsi="Arial" w:cs="Arial"/>
+                <w:sz w:val="20"/>
+                <w:szCs w:val="20"/>
+              </w:rPr>
+              <w:t>Body Type</w:t>
+            </w:r>
+          </w:p>
+        </w:tc>
+      </w:tr>
+      <w:tr>
+        <w:trPr>
+          <w:trHeight w:val="255"/>
+        </w:trPr>
+        <w:tc>
+          <w:tcPr>
+            <w:tcW w:w="735" w:type="dxa"/>
+            <w:tcBorders>
+              <w:top w:val="nil"/>
+              <w:left w:val="single" w:sz="4" w:space="0" w:color="auto"/>
+              <w:bottom w:val="single" w:sz="4" w:space="0" w:color="auto"/>
+              <w:right w:val="single" w:sz="4" w:space="0" w:color="auto"/>
+            </w:tcBorders>
+            <w:shd w:val="clear" w:color="auto" w:fill="auto"/>
+            <w:noWrap/>
+            <w:vAlign w:val="bottom"/>
+            <w:hideMark/>
+          </w:tcPr>
+          <w:p>
+            <w:pPr>
+              <w:spacing w:after="0" w:line="240" w:lineRule="auto"/>
+              <w:rPr>
+                <w:rFonts w:ascii="Arial" w:eastAsia="Times New Roman" w:hAnsi="Arial" w:cs="Arial"/>
+                <w:sz w:val="20"/>
+                <w:szCs w:val="20"/>
+              </w:rPr>
+            </w:pPr>
+            <w:r>
+              <w:rPr>
+                <w:rFonts w:ascii="Arial" w:eastAsia="Times New Roman" w:hAnsi="Arial" w:cs="Arial"/>
+                <w:sz w:val="20"/>
+                <w:szCs w:val="20"/>
+              </w:rPr>
+              <w:t>1</w:t>
+            </w:r>
+          </w:p>
+        </w:tc>
+        <w:tc>
+          <w:tcPr>
+            <w:tcW w:w="2520" w:type="dxa"/>
+            <w:tcBorders>
+              <w:top w:val="single" w:sz="4" w:space="0" w:color="auto"/>
+              <w:left w:val="nil"/>
+              <w:bottom w:val="single" w:sz="4" w:space="0" w:color="auto"/>
+              <w:right w:val="single" w:sz="4" w:space="0" w:color="auto"/>
+            </w:tcBorders>
+            <w:shd w:val="clear" w:color="auto" w:fill="auto"/>
+            <w:noWrap/>
+            <w:vAlign w:val="bottom"/>
+            <w:hideMark/>
+          </w:tcPr>
+          <w:p>
+            <w:pPr>
+              <w:spacing w:after="0" w:line="240" w:lineRule="auto"/>
+              <w:rPr>
+                <w:rFonts w:ascii="Arial" w:eastAsia="Times New Roman" w:hAnsi="Arial" w:cs="Arial"/>
+                <w:sz w:val="20"/>
+                <w:szCs w:val="20"/>
+              </w:rPr>
+            </w:pPr>
+            <w:r>
+              <w:rPr>
+                <w:rFonts w:ascii="Arial" w:eastAsia="Times New Roman" w:hAnsi="Arial" w:cs="Arial"/>
+                <w:sz w:val="20"/>
+                <w:szCs w:val="20"/>
+              </w:rPr>
+              <w:t>TRANSFER Trailer</w:t>
+            </w:r>
+          </w:p>
+        </w:tc>
+      </w:tr>
+      <w:tr>
+        <w:trPr>
+          <w:trHeight w:val="255"/>
+        </w:trPr>
+        <w:tc>
+          <w:tcPr>
+            <w:tcW w:w="735" w:type="dxa"/>
+            <w:tcBorders>
+              <w:top w:val="single" w:sz="4" w:space="0" w:color="auto"/>
+              <w:left w:val="single" w:sz="4" w:space="0" w:color="auto"/>
+              <w:bottom w:val="single" w:sz="4" w:space="0" w:color="auto"/>
+              <w:right w:val="single" w:sz="4" w:space="0" w:color="auto"/>
+            </w:tcBorders>
+            <w:shd w:val="clear" w:color="auto" w:fill="auto"/>
+            <w:noWrap/>
+            <w:vAlign w:val="bottom"/>
+            <w:hideMark/>
+          </w:tcPr>
+          <w:p>
+            <w:pPr>
+              <w:spacing w:after="0" w:line="240" w:lineRule="auto"/>
+              <w:rPr>
+                <w:rFonts w:ascii="Arial" w:eastAsia="Times New Roman" w:hAnsi="Arial" w:cs="Arial"/>
+                <w:sz w:val="20"/>
+                <w:szCs w:val="20"/>
+              </w:rPr>
+            </w:pPr>
+            <w:r>
+              <w:rPr>
+                <w:rFonts w:ascii="Arial" w:eastAsia="Times New Roman" w:hAnsi="Arial" w:cs="Arial"/>
+                <w:sz w:val="20"/>
+                <w:szCs w:val="20"/>
+              </w:rPr>
+              <w:t>2</w:t>
+            </w:r>
+          </w:p>
+        </w:tc>
+        <w:tc>
+          <w:tcPr>
+            <w:tcW w:w="2520" w:type="dxa"/>
+            <w:tcBorders>
+              <w:top w:val="single" w:sz="4" w:space="0" w:color="auto"/>
+              <w:left w:val="nil"/>
+              <w:bottom w:val="single" w:sz="4" w:space="0" w:color="auto"/>
+              <w:right w:val="single" w:sz="4" w:space="0" w:color="auto"/>
+            </w:tcBorders>
+            <w:shd w:val="clear" w:color="auto" w:fill="auto"/>
+            <w:noWrap/>
+            <w:vAlign w:val="bottom"/>
+            <w:hideMark/>
+          </w:tcPr>
+          <w:p>
+            <w:pPr>
+              <w:spacing w:after="0" w:line="240" w:lineRule="auto"/>
+              <w:rPr>
+                <w:rFonts w:ascii="Arial" w:eastAsia="Times New Roman" w:hAnsi="Arial" w:cs="Arial"/>
+                <w:sz w:val="20"/>
+                <w:szCs w:val="20"/>
+              </w:rPr>
+            </w:pPr>
+            <w:r>
+              <w:rPr>
+                <w:rFonts w:ascii="Arial" w:eastAsia="Times New Roman" w:hAnsi="Arial" w:cs="Arial"/>
+                <w:sz w:val="20"/>
+                <w:szCs w:val="20"/>
+              </w:rPr>
+              <w:t>B-Train Lead Trailer</w:t>
+            </w:r>
+          </w:p>
+        </w:tc>
+      </w:tr>
+      <w:tr>
+        <w:trPr>
+          <w:trHeight w:val="255"/>
+        </w:trPr>
+        <w:tc>
+          <w:tcPr>
+            <w:tcW w:w="735" w:type="dxa"/>
+            <w:tcBorders>
+              <w:top w:val="single" w:sz="4" w:space="0" w:color="auto"/>
+              <w:left w:val="single" w:sz="4" w:space="0" w:color="auto"/>
+              <w:bottom w:val="single" w:sz="4" w:space="0" w:color="auto"/>
+              <w:right w:val="single" w:sz="4" w:space="0" w:color="auto"/>
+            </w:tcBorders>
+            <w:shd w:val="clear" w:color="auto" w:fill="auto"/>
+            <w:noWrap/>
+            <w:vAlign w:val="bottom"/>
+            <w:hideMark/>
+          </w:tcPr>
+          <w:p>
+            <w:pPr>
+              <w:spacing w:after="0" w:line="240" w:lineRule="auto"/>
+              <w:rPr>
+                <w:rFonts w:ascii="Arial" w:eastAsia="Times New Roman" w:hAnsi="Arial" w:cs="Arial"/>
+                <w:sz w:val="20"/>
+                <w:szCs w:val="20"/>
+              </w:rPr>
+            </w:pPr>
+            <w:r>
+              <w:rPr>
+                <w:rFonts w:ascii="Arial" w:eastAsia="Times New Roman" w:hAnsi="Arial" w:cs="Arial"/>
+                <w:sz w:val="20"/>
+                <w:szCs w:val="20"/>
+              </w:rPr>
+              <w:t>3</w:t>
+            </w:r>
+          </w:p>
+        </w:tc>
+        <w:tc>
+          <w:tcPr>
+            <w:tcW w:w="2520" w:type="dxa"/>
+            <w:tcBorders>
+              <w:top w:val="single" w:sz="4" w:space="0" w:color="auto"/>
+              <w:left w:val="nil"/>
+              <w:bottom w:val="single" w:sz="4" w:space="0" w:color="auto"/>
+              <w:right w:val="single" w:sz="4" w:space="0" w:color="auto"/>
+            </w:tcBorders>
+            <w:shd w:val="clear" w:color="auto" w:fill="auto"/>
+            <w:noWrap/>
+            <w:vAlign w:val="bottom"/>
+            <w:hideMark/>
+          </w:tcPr>
+          <w:p>
+            <w:pPr>
+              <w:spacing w:after="0" w:line="240" w:lineRule="auto"/>
+              <w:rPr>
+                <w:rFonts w:ascii="Arial" w:eastAsia="Times New Roman" w:hAnsi="Arial" w:cs="Arial"/>
+                <w:sz w:val="20"/>
+                <w:szCs w:val="20"/>
+              </w:rPr>
+            </w:pPr>
+            <w:r>
+              <w:rPr>
+                <w:rFonts w:ascii="Arial" w:eastAsia="Times New Roman" w:hAnsi="Arial" w:cs="Arial"/>
+                <w:sz w:val="20"/>
+                <w:szCs w:val="20"/>
+              </w:rPr>
+              <w:t>B-Train Pull Trailer</w:t>
+            </w:r>
+          </w:p>
+        </w:tc>
+      </w:tr>
+      <w:tr>
+        <w:trPr>
+          <w:trHeight w:val="255"/>
+        </w:trPr>
+        <w:tc>
+          <w:tcPr>
+            <w:tcW w:w="735" w:type="dxa"/>
+            <w:tcBorders>
+              <w:top w:val="single" w:sz="4" w:space="0" w:color="auto"/>
+              <w:left w:val="single" w:sz="4" w:space="0" w:color="auto"/>
+              <w:bottom w:val="single" w:sz="4" w:space="0" w:color="auto"/>
+              <w:right w:val="single" w:sz="4" w:space="0" w:color="auto"/>
+            </w:tcBorders>
+            <w:shd w:val="clear" w:color="auto" w:fill="auto"/>
+            <w:noWrap/>
+            <w:vAlign w:val="bottom"/>
+            <w:hideMark/>
+          </w:tcPr>
+          <w:p>
+            <w:pPr>
+              <w:spacing w:after="0" w:line="240" w:lineRule="auto"/>
+              <w:rPr>
+                <w:rFonts w:ascii="Arial" w:eastAsia="Times New Roman" w:hAnsi="Arial" w:cs="Arial"/>
+                <w:sz w:val="20"/>
+                <w:szCs w:val="20"/>
+              </w:rPr>
+            </w:pPr>
+            <w:r>
+              <w:rPr>
+                <w:rFonts w:ascii="Arial" w:eastAsia="Times New Roman" w:hAnsi="Arial" w:cs="Arial"/>
+                <w:sz w:val="20"/>
+                <w:szCs w:val="20"/>
+              </w:rPr>
+              <w:t>4</w:t>
+            </w:r>
+          </w:p>
+        </w:tc>
+        <w:tc>
+          <w:tcPr>
+            <w:tcW w:w="2520" w:type="dxa"/>
+            <w:tcBorders>
+              <w:top w:val="single" w:sz="4" w:space="0" w:color="auto"/>
+              <w:left w:val="nil"/>
+              <w:bottom w:val="single" w:sz="4" w:space="0" w:color="auto"/>
+              <w:right w:val="single" w:sz="4" w:space="0" w:color="auto"/>
+            </w:tcBorders>
+            <w:shd w:val="clear" w:color="auto" w:fill="auto"/>
+            <w:noWrap/>
+            <w:vAlign w:val="bottom"/>
+            <w:hideMark/>
+          </w:tcPr>
+          <w:p>
+            <w:pPr>
+              <w:spacing w:after="0" w:line="240" w:lineRule="auto"/>
+              <w:rPr>
+                <w:rFonts w:ascii="Arial" w:eastAsia="Times New Roman" w:hAnsi="Arial" w:cs="Arial"/>
+                <w:sz w:val="20"/>
+                <w:szCs w:val="20"/>
+              </w:rPr>
+            </w:pPr>
+            <w:r>
+              <w:rPr>
+                <w:rFonts w:ascii="Arial" w:eastAsia="Times New Roman" w:hAnsi="Arial" w:cs="Arial"/>
+                <w:sz w:val="20"/>
+                <w:szCs w:val="20"/>
+              </w:rPr>
+              <w:t> </w:t>
+            </w:r>
+          </w:p>
+        </w:tc>
+      </w:tr>
+      <w:tr>
+        <w:trPr>
+          <w:trHeight w:val="255"/>
+        </w:trPr>
+        <w:tc>
+          <w:tcPr>
+            <w:tcW w:w="735" w:type="dxa"/>
+            <w:tcBorders>
+              <w:top w:val="single" w:sz="4" w:space="0" w:color="auto"/>
+              <w:left w:val="single" w:sz="4" w:space="0" w:color="auto"/>
+              <w:bottom w:val="single" w:sz="4" w:space="0" w:color="auto"/>
+              <w:right w:val="single" w:sz="4" w:space="0" w:color="auto"/>
+            </w:tcBorders>
+            <w:shd w:val="clear" w:color="auto" w:fill="auto"/>
+            <w:noWrap/>
+            <w:vAlign w:val="bottom"/>
+            <w:hideMark/>
+          </w:tcPr>
+          <w:p>
+            <w:pPr>
+              <w:spacing w:after="0" w:line="240" w:lineRule="auto"/>
+              <w:rPr>
+                <w:rFonts w:ascii="Arial" w:eastAsia="Times New Roman" w:hAnsi="Arial" w:cs="Arial"/>
+                <w:sz w:val="20"/>
+                <w:szCs w:val="20"/>
+              </w:rPr>
+            </w:pPr>
+            <w:r>
+              <w:rPr>
+                <w:rFonts w:ascii="Arial" w:eastAsia="Times New Roman" w:hAnsi="Arial" w:cs="Arial"/>
+                <w:sz w:val="20"/>
+                <w:szCs w:val="20"/>
+              </w:rPr>
+              <w:t>5</w:t>
+            </w:r>
+          </w:p>
+        </w:tc>
+        <w:tc>
+          <w:tcPr>
+            <w:tcW w:w="2520" w:type="dxa"/>
+            <w:tcBorders>
+              <w:top w:val="single" w:sz="4" w:space="0" w:color="auto"/>
+              <w:left w:val="nil"/>
+              <w:bottom w:val="single" w:sz="4" w:space="0" w:color="auto"/>
+              <w:right w:val="single" w:sz="4" w:space="0" w:color="auto"/>
+            </w:tcBorders>
+            <w:shd w:val="clear" w:color="auto" w:fill="auto"/>
+            <w:noWrap/>
+            <w:vAlign w:val="bottom"/>
+            <w:hideMark/>
+          </w:tcPr>
+          <w:p>
+            <w:pPr>
+              <w:spacing w:after="0" w:line="240" w:lineRule="auto"/>
+              <w:rPr>
+                <w:rFonts w:ascii="Arial" w:eastAsia="Times New Roman" w:hAnsi="Arial" w:cs="Arial"/>
+                <w:sz w:val="20"/>
+                <w:szCs w:val="20"/>
+              </w:rPr>
+            </w:pPr>
+            <w:r>
+              <w:rPr>
+                <w:rFonts w:ascii="Arial" w:eastAsia="Times New Roman" w:hAnsi="Arial" w:cs="Arial"/>
+                <w:sz w:val="20"/>
+                <w:szCs w:val="20"/>
+              </w:rPr>
+              <w:t> </w:t>
+            </w:r>
+          </w:p>
+        </w:tc>
+      </w:tr>
+      <w:tr>
+        <w:trPr>
+          <w:trHeight w:val="255"/>
+        </w:trPr>
+        <w:tc>
+          <w:tcPr>
+            <w:tcW w:w="735" w:type="dxa"/>
+            <w:tcBorders>
+              <w:top w:val="single" w:sz="4" w:space="0" w:color="auto"/>
+              <w:left w:val="single" w:sz="4" w:space="0" w:color="auto"/>
+              <w:bottom w:val="single" w:sz="4" w:space="0" w:color="auto"/>
+              <w:right w:val="single" w:sz="4" w:space="0" w:color="auto"/>
+            </w:tcBorders>
+            <w:shd w:val="clear" w:color="auto" w:fill="auto"/>
+            <w:noWrap/>
+            <w:vAlign w:val="bottom"/>
+            <w:hideMark/>
+          </w:tcPr>
+          <w:p>
+            <w:pPr>
+              <w:spacing w:after="0" w:line="240" w:lineRule="auto"/>
+              <w:rPr>
+                <w:rFonts w:ascii="Arial" w:eastAsia="Times New Roman" w:hAnsi="Arial" w:cs="Arial"/>
+                <w:sz w:val="20"/>
+                <w:szCs w:val="20"/>
+              </w:rPr>
+            </w:pPr>
+            <w:r>
+              <w:rPr>
+                <w:rFonts w:ascii="Arial" w:eastAsia="Times New Roman" w:hAnsi="Arial" w:cs="Arial"/>
+                <w:sz w:val="20"/>
+                <w:szCs w:val="20"/>
+              </w:rPr>
+              <w:t>6</w:t>
+            </w:r>
+          </w:p>
+        </w:tc>
+        <w:tc>
+          <w:tcPr>
+            <w:tcW w:w="2520" w:type="dxa"/>
+            <w:tcBorders>
+              <w:top w:val="single" w:sz="4" w:space="0" w:color="auto"/>
+              <w:left w:val="nil"/>
+              <w:bottom w:val="single" w:sz="4" w:space="0" w:color="auto"/>
+              <w:right w:val="single" w:sz="4" w:space="0" w:color="auto"/>
+            </w:tcBorders>
+            <w:shd w:val="clear" w:color="auto" w:fill="auto"/>
+            <w:noWrap/>
+            <w:vAlign w:val="bottom"/>
+            <w:hideMark/>
+          </w:tcPr>
+          <w:p>
+            <w:pPr>
+              <w:spacing w:after="0" w:line="240" w:lineRule="auto"/>
+              <w:rPr>
+                <w:rFonts w:ascii="Arial" w:eastAsia="Times New Roman" w:hAnsi="Arial" w:cs="Arial"/>
+                <w:sz w:val="20"/>
+                <w:szCs w:val="20"/>
+              </w:rPr>
+            </w:pPr>
+            <w:r>
+              <w:rPr>
+                <w:rFonts w:ascii="Arial" w:eastAsia="Times New Roman" w:hAnsi="Arial" w:cs="Arial"/>
+                <w:sz w:val="20"/>
+                <w:szCs w:val="20"/>
+              </w:rPr>
+              <w:t> </w:t>
+            </w:r>
+          </w:p>
+        </w:tc>
+      </w:tr>
+      <w:tr>
+        <w:trPr>
+          <w:trHeight w:val="255"/>
+        </w:trPr>
+        <w:tc>
+          <w:tcPr>
+            <w:tcW w:w="735" w:type="dxa"/>
+            <w:tcBorders>
+              <w:top w:val="single" w:sz="4" w:space="0" w:color="auto"/>
+              <w:left w:val="single" w:sz="4" w:space="0" w:color="auto"/>
+              <w:bottom w:val="single" w:sz="4" w:space="0" w:color="auto"/>
+              <w:right w:val="single" w:sz="4" w:space="0" w:color="auto"/>
+            </w:tcBorders>
+            <w:shd w:val="clear" w:color="auto" w:fill="auto"/>
+            <w:noWrap/>
+            <w:vAlign w:val="bottom"/>
+            <w:hideMark/>
+          </w:tcPr>
+          <w:p>
+            <w:pPr>
+              <w:spacing w:after="0" w:line="240" w:lineRule="auto"/>
+              <w:rPr>
+                <w:rFonts w:ascii="Arial" w:eastAsia="Times New Roman" w:hAnsi="Arial" w:cs="Arial"/>
+                <w:sz w:val="20"/>
+                <w:szCs w:val="20"/>
+              </w:rPr>
+            </w:pPr>
+            <w:r>
+              <w:rPr>
+                <w:rFonts w:ascii="Arial" w:eastAsia="Times New Roman" w:hAnsi="Arial" w:cs="Arial"/>
+                <w:sz w:val="20"/>
+                <w:szCs w:val="20"/>
+              </w:rPr>
+              <w:t>7</w:t>
+            </w:r>
+          </w:p>
+        </w:tc>
+        <w:tc>
+          <w:tcPr>
+            <w:tcW w:w="2520" w:type="dxa"/>
+            <w:tcBorders>
+              <w:top w:val="single" w:sz="4" w:space="0" w:color="auto"/>
+              <w:left w:val="nil"/>
+              <w:bottom w:val="single" w:sz="4" w:space="0" w:color="auto"/>
+              <w:right w:val="single" w:sz="4" w:space="0" w:color="auto"/>
+            </w:tcBorders>
+            <w:shd w:val="clear" w:color="auto" w:fill="auto"/>
+            <w:noWrap/>
+            <w:vAlign w:val="bottom"/>
+            <w:hideMark/>
+          </w:tcPr>
+          <w:p>
+            <w:pPr>
+              <w:spacing w:after="0" w:line="240" w:lineRule="auto"/>
+              <w:rPr>
+                <w:rFonts w:ascii="Arial" w:eastAsia="Times New Roman" w:hAnsi="Arial" w:cs="Arial"/>
+                <w:sz w:val="20"/>
+                <w:szCs w:val="20"/>
+              </w:rPr>
+            </w:pPr>
+            <w:r>
+              <w:rPr>
+                <w:rFonts w:ascii="Arial" w:eastAsia="Times New Roman" w:hAnsi="Arial" w:cs="Arial"/>
+                <w:sz w:val="20"/>
+                <w:szCs w:val="20"/>
+              </w:rPr>
+              <w:t> </w:t>
+            </w:r>
+          </w:p>
+        </w:tc>
+      </w:tr>
+      <w:tr>
+        <w:trPr>
+          <w:trHeight w:val="255"/>
+        </w:trPr>
+        <w:tc>
+          <w:tcPr>
+            <w:tcW w:w="735" w:type="dxa"/>
+            <w:tcBorders>
+              <w:top w:val="single" w:sz="4" w:space="0" w:color="auto"/>
+              <w:left w:val="single" w:sz="4" w:space="0" w:color="auto"/>
+              <w:bottom w:val="single" w:sz="4" w:space="0" w:color="auto"/>
+              <w:right w:val="single" w:sz="4" w:space="0" w:color="auto"/>
+            </w:tcBorders>
+            <w:shd w:val="clear" w:color="auto" w:fill="auto"/>
+            <w:noWrap/>
+            <w:vAlign w:val="bottom"/>
+            <w:hideMark/>
+          </w:tcPr>
+          <w:p>
+            <w:pPr>
+              <w:spacing w:after="0" w:line="240" w:lineRule="auto"/>
+              <w:rPr>
+                <w:rFonts w:ascii="Arial" w:eastAsia="Times New Roman" w:hAnsi="Arial" w:cs="Arial"/>
+                <w:sz w:val="20"/>
+                <w:szCs w:val="20"/>
+              </w:rPr>
+            </w:pPr>
+            <w:r>
+              <w:rPr>
+                <w:rFonts w:ascii="Arial" w:eastAsia="Times New Roman" w:hAnsi="Arial" w:cs="Arial"/>
+                <w:sz w:val="20"/>
+                <w:szCs w:val="20"/>
+              </w:rPr>
+              <w:t>8</w:t>
+            </w:r>
+          </w:p>
+        </w:tc>
+        <w:tc>
+          <w:tcPr>
+            <w:tcW w:w="2520" w:type="dxa"/>
+            <w:tcBorders>
+              <w:top w:val="single" w:sz="4" w:space="0" w:color="auto"/>
+              <w:left w:val="nil"/>
+              <w:bottom w:val="single" w:sz="4" w:space="0" w:color="auto"/>
+              <w:right w:val="single" w:sz="4" w:space="0" w:color="auto"/>
+            </w:tcBorders>
+            <w:shd w:val="clear" w:color="auto" w:fill="auto"/>
+            <w:noWrap/>
+            <w:vAlign w:val="bottom"/>
+            <w:hideMark/>
+          </w:tcPr>
+          <w:p>
+            <w:pPr>
+              <w:spacing w:after="0" w:line="240" w:lineRule="auto"/>
+              <w:rPr>
+                <w:rFonts w:ascii="Arial" w:eastAsia="Times New Roman" w:hAnsi="Arial" w:cs="Arial"/>
+                <w:sz w:val="20"/>
+                <w:szCs w:val="20"/>
+              </w:rPr>
+            </w:pPr>
+            <w:r>
+              <w:rPr>
+                <w:rFonts w:ascii="Arial" w:eastAsia="Times New Roman" w:hAnsi="Arial" w:cs="Arial"/>
+                <w:sz w:val="20"/>
+                <w:szCs w:val="20"/>
+              </w:rPr>
+              <w:t> </w:t>
+            </w:r>
+          </w:p>
+        </w:tc>
+      </w:tr>
+      <w:tr>
+        <w:trPr>
+          <w:trHeight w:val="255"/>
+        </w:trPr>
+        <w:tc>
+          <w:tcPr>
+            <w:tcW w:w="735" w:type="dxa"/>
+            <w:tcBorders>
+              <w:top w:val="single" w:sz="4" w:space="0" w:color="auto"/>
+              <w:left w:val="single" w:sz="4" w:space="0" w:color="auto"/>
+              <w:bottom w:val="single" w:sz="4" w:space="0" w:color="auto"/>
+              <w:right w:val="single" w:sz="4" w:space="0" w:color="auto"/>
+            </w:tcBorders>
+            <w:shd w:val="clear" w:color="auto" w:fill="auto"/>
+            <w:noWrap/>
+            <w:vAlign w:val="bottom"/>
+            <w:hideMark/>
+          </w:tcPr>
+          <w:p>
+            <w:pPr>
+              <w:spacing w:after="0" w:line="240" w:lineRule="auto"/>
+              <w:rPr>
+                <w:rFonts w:ascii="Arial" w:eastAsia="Times New Roman" w:hAnsi="Arial" w:cs="Arial"/>
+                <w:sz w:val="20"/>
+                <w:szCs w:val="20"/>
+              </w:rPr>
+            </w:pPr>
+            <w:r>
+              <w:rPr>
+                <w:rFonts w:ascii="Arial" w:eastAsia="Times New Roman" w:hAnsi="Arial" w:cs="Arial"/>
+                <w:sz w:val="20"/>
+                <w:szCs w:val="20"/>
+              </w:rPr>
+              <w:t>9</w:t>
+            </w:r>
+          </w:p>
+        </w:tc>
+        <w:tc>
+          <w:tcPr>
+            <w:tcW w:w="2520" w:type="dxa"/>
+            <w:tcBorders>
+              <w:top w:val="single" w:sz="4" w:space="0" w:color="auto"/>
+              <w:left w:val="nil"/>
+              <w:bottom w:val="single" w:sz="4" w:space="0" w:color="auto"/>
+              <w:right w:val="single" w:sz="4" w:space="0" w:color="auto"/>
+            </w:tcBorders>
+            <w:shd w:val="clear" w:color="auto" w:fill="auto"/>
+            <w:noWrap/>
+            <w:vAlign w:val="bottom"/>
+            <w:hideMark/>
+          </w:tcPr>
+          <w:p>
+            <w:pPr>
+              <w:spacing w:after="0" w:line="240" w:lineRule="auto"/>
+              <w:rPr>
+                <w:rFonts w:ascii="Arial" w:eastAsia="Times New Roman" w:hAnsi="Arial" w:cs="Arial"/>
+                <w:sz w:val="20"/>
+                <w:szCs w:val="20"/>
+              </w:rPr>
+            </w:pPr>
+            <w:r>
+              <w:rPr>
+                <w:rFonts w:ascii="Arial" w:eastAsia="Times New Roman" w:hAnsi="Arial" w:cs="Arial"/>
+                <w:sz w:val="20"/>
+                <w:szCs w:val="20"/>
+              </w:rPr>
+              <w:t> </w:t>
+            </w:r>
+          </w:p>
+        </w:tc>
+      </w:tr>
+      <w:tr>
+        <w:trPr>
+          <w:trHeight w:val="255"/>
+        </w:trPr>
+        <w:tc>
+          <w:tcPr>
+            <w:tcW w:w="735" w:type="dxa"/>
+            <w:tcBorders>
+              <w:top w:val="single" w:sz="4" w:space="0" w:color="auto"/>
+              <w:left w:val="single" w:sz="4" w:space="0" w:color="auto"/>
+              <w:bottom w:val="single" w:sz="4" w:space="0" w:color="auto"/>
+              <w:right w:val="single" w:sz="4" w:space="0" w:color="auto"/>
+            </w:tcBorders>
+            <w:shd w:val="clear" w:color="auto" w:fill="auto"/>
+            <w:noWrap/>
+            <w:vAlign w:val="bottom"/>
+            <w:hideMark/>
+          </w:tcPr>
+          <w:p>
+            <w:pPr>
+              <w:spacing w:after="0" w:line="240" w:lineRule="auto"/>
+              <w:rPr>
+                <w:rFonts w:ascii="Arial" w:eastAsia="Times New Roman" w:hAnsi="Arial" w:cs="Arial"/>
+                <w:sz w:val="20"/>
+                <w:szCs w:val="20"/>
+              </w:rPr>
+            </w:pPr>
+            <w:r>
+              <w:rPr>
+                <w:rFonts w:ascii="Arial" w:eastAsia="Times New Roman" w:hAnsi="Arial" w:cs="Arial"/>
+                <w:sz w:val="20"/>
+                <w:szCs w:val="20"/>
+              </w:rPr>
+              <w:t>A</w:t>
+            </w:r>
+          </w:p>
+        </w:tc>
+        <w:tc>
+          <w:tcPr>
+            <w:tcW w:w="2520" w:type="dxa"/>
+            <w:tcBorders>
+              <w:top w:val="single" w:sz="4" w:space="0" w:color="auto"/>
+              <w:left w:val="nil"/>
+              <w:bottom w:val="single" w:sz="4" w:space="0" w:color="auto"/>
+              <w:right w:val="single" w:sz="4" w:space="0" w:color="auto"/>
+            </w:tcBorders>
+            <w:shd w:val="clear" w:color="auto" w:fill="auto"/>
+            <w:noWrap/>
+            <w:vAlign w:val="bottom"/>
+            <w:hideMark/>
+          </w:tcPr>
+          <w:p>
+            <w:pPr>
+              <w:spacing w:after="0" w:line="240" w:lineRule="auto"/>
+              <w:rPr>
+                <w:rFonts w:ascii="Arial" w:eastAsia="Times New Roman" w:hAnsi="Arial" w:cs="Arial"/>
+                <w:sz w:val="20"/>
+                <w:szCs w:val="20"/>
+              </w:rPr>
+            </w:pPr>
+            <w:r>
+              <w:rPr>
+                <w:rFonts w:ascii="Arial" w:eastAsia="Times New Roman" w:hAnsi="Arial" w:cs="Arial"/>
+                <w:sz w:val="20"/>
+                <w:szCs w:val="20"/>
+              </w:rPr>
+              <w:t> </w:t>
+            </w:r>
+          </w:p>
+        </w:tc>
+      </w:tr>
+      <w:tr>
+        <w:trPr>
+          <w:trHeight w:val="255"/>
+        </w:trPr>
+        <w:tc>
+          <w:tcPr>
+            <w:tcW w:w="735" w:type="dxa"/>
+            <w:tcBorders>
+              <w:top w:val="single" w:sz="4" w:space="0" w:color="auto"/>
+              <w:left w:val="single" w:sz="4" w:space="0" w:color="auto"/>
+              <w:bottom w:val="single" w:sz="4" w:space="0" w:color="auto"/>
+              <w:right w:val="single" w:sz="4" w:space="0" w:color="auto"/>
+            </w:tcBorders>
+            <w:shd w:val="clear" w:color="auto" w:fill="auto"/>
+            <w:noWrap/>
+            <w:vAlign w:val="bottom"/>
+            <w:hideMark/>
+          </w:tcPr>
+          <w:p>
+            <w:pPr>
+              <w:spacing w:after="0" w:line="240" w:lineRule="auto"/>
+              <w:rPr>
+                <w:rFonts w:ascii="Arial" w:eastAsia="Times New Roman" w:hAnsi="Arial" w:cs="Arial"/>
+                <w:sz w:val="20"/>
+                <w:szCs w:val="20"/>
+              </w:rPr>
+            </w:pPr>
+            <w:r>
+              <w:rPr>
+                <w:rFonts w:ascii="Arial" w:eastAsia="Times New Roman" w:hAnsi="Arial" w:cs="Arial"/>
+                <w:sz w:val="20"/>
+                <w:szCs w:val="20"/>
+              </w:rPr>
+              <w:t>B</w:t>
+            </w:r>
+          </w:p>
+        </w:tc>
+        <w:tc>
+          <w:tcPr>
+            <w:tcW w:w="2520" w:type="dxa"/>
+            <w:tcBorders>
+              <w:top w:val="single" w:sz="4" w:space="0" w:color="auto"/>
+              <w:left w:val="nil"/>
+              <w:bottom w:val="single" w:sz="4" w:space="0" w:color="auto"/>
+              <w:right w:val="single" w:sz="4" w:space="0" w:color="auto"/>
+            </w:tcBorders>
+            <w:shd w:val="clear" w:color="auto" w:fill="auto"/>
+            <w:noWrap/>
+            <w:vAlign w:val="bottom"/>
+            <w:hideMark/>
+          </w:tcPr>
+          <w:p>
+            <w:pPr>
+              <w:spacing w:after="0" w:line="240" w:lineRule="auto"/>
+              <w:rPr>
+                <w:rFonts w:ascii="Arial" w:eastAsia="Times New Roman" w:hAnsi="Arial" w:cs="Arial"/>
+                <w:sz w:val="20"/>
+                <w:szCs w:val="20"/>
+              </w:rPr>
+            </w:pPr>
+            <w:r>
+              <w:rPr>
+                <w:rFonts w:ascii="Arial" w:eastAsia="Times New Roman" w:hAnsi="Arial" w:cs="Arial"/>
+                <w:sz w:val="20"/>
+                <w:szCs w:val="20"/>
+              </w:rPr>
+              <w:t>LIVE BOTTOM Trailer</w:t>
+            </w:r>
+          </w:p>
+        </w:tc>
+      </w:tr>
+      <w:tr>
+        <w:trPr>
+          <w:trHeight w:val="255"/>
+        </w:trPr>
+        <w:tc>
+          <w:tcPr>
+            <w:tcW w:w="735" w:type="dxa"/>
+            <w:tcBorders>
+              <w:top w:val="single" w:sz="4" w:space="0" w:color="auto"/>
+              <w:left w:val="single" w:sz="4" w:space="0" w:color="auto"/>
+              <w:bottom w:val="single" w:sz="4" w:space="0" w:color="auto"/>
+              <w:right w:val="single" w:sz="4" w:space="0" w:color="auto"/>
+            </w:tcBorders>
+            <w:shd w:val="clear" w:color="auto" w:fill="auto"/>
+            <w:noWrap/>
+            <w:vAlign w:val="bottom"/>
+            <w:hideMark/>
+          </w:tcPr>
+          <w:p>
+            <w:pPr>
+              <w:spacing w:after="0" w:line="240" w:lineRule="auto"/>
+              <w:rPr>
+                <w:rFonts w:ascii="Arial" w:eastAsia="Times New Roman" w:hAnsi="Arial" w:cs="Arial"/>
+                <w:sz w:val="20"/>
+                <w:szCs w:val="20"/>
+              </w:rPr>
+            </w:pPr>
+            <w:r>
+              <w:rPr>
+                <w:rFonts w:ascii="Arial" w:eastAsia="Times New Roman" w:hAnsi="Arial" w:cs="Arial"/>
+                <w:sz w:val="20"/>
+                <w:szCs w:val="20"/>
+              </w:rPr>
+              <w:t>C</w:t>
+            </w:r>
+          </w:p>
+        </w:tc>
+        <w:tc>
+          <w:tcPr>
+            <w:tcW w:w="2520" w:type="dxa"/>
+            <w:tcBorders>
+              <w:top w:val="single" w:sz="4" w:space="0" w:color="auto"/>
+              <w:left w:val="nil"/>
+              <w:bottom w:val="single" w:sz="4" w:space="0" w:color="auto"/>
+              <w:right w:val="single" w:sz="4" w:space="0" w:color="auto"/>
+            </w:tcBorders>
+            <w:shd w:val="clear" w:color="auto" w:fill="auto"/>
+            <w:noWrap/>
+            <w:vAlign w:val="bottom"/>
+            <w:hideMark/>
+          </w:tcPr>
+          <w:p>
+            <w:pPr>
+              <w:spacing w:after="0" w:line="240" w:lineRule="auto"/>
+              <w:rPr>
+                <w:rFonts w:ascii="Arial" w:eastAsia="Times New Roman" w:hAnsi="Arial" w:cs="Arial"/>
+                <w:sz w:val="20"/>
+                <w:szCs w:val="20"/>
+              </w:rPr>
+            </w:pPr>
+            <w:r>
+              <w:rPr>
+                <w:rFonts w:ascii="Arial" w:eastAsia="Times New Roman" w:hAnsi="Arial" w:cs="Arial"/>
+                <w:sz w:val="20"/>
+                <w:szCs w:val="20"/>
+              </w:rPr>
+              <w:t> </w:t>
+            </w:r>
+          </w:p>
+        </w:tc>
+      </w:tr>
+      <w:tr>
+        <w:trPr>
+          <w:trHeight w:val="255"/>
+        </w:trPr>
+        <w:tc>
+          <w:tcPr>
+            <w:tcW w:w="735" w:type="dxa"/>
+            <w:tcBorders>
+              <w:top w:val="single" w:sz="4" w:space="0" w:color="auto"/>
+              <w:left w:val="single" w:sz="4" w:space="0" w:color="auto"/>
+              <w:bottom w:val="single" w:sz="4" w:space="0" w:color="auto"/>
+              <w:right w:val="single" w:sz="4" w:space="0" w:color="auto"/>
+            </w:tcBorders>
+            <w:shd w:val="clear" w:color="auto" w:fill="auto"/>
+            <w:noWrap/>
+            <w:vAlign w:val="bottom"/>
+            <w:hideMark/>
+          </w:tcPr>
+          <w:p>
+            <w:pPr>
+              <w:spacing w:after="0" w:line="240" w:lineRule="auto"/>
+              <w:rPr>
+                <w:rFonts w:ascii="Arial" w:eastAsia="Times New Roman" w:hAnsi="Arial" w:cs="Arial"/>
+                <w:sz w:val="20"/>
+                <w:szCs w:val="20"/>
+              </w:rPr>
+            </w:pPr>
+            <w:r>
+              <w:rPr>
+                <w:rFonts w:ascii="Arial" w:eastAsia="Times New Roman" w:hAnsi="Arial" w:cs="Arial"/>
+                <w:sz w:val="20"/>
+                <w:szCs w:val="20"/>
+              </w:rPr>
+              <w:t>D</w:t>
+            </w:r>
+          </w:p>
+        </w:tc>
+        <w:tc>
+          <w:tcPr>
+            <w:tcW w:w="2520" w:type="dxa"/>
+            <w:tcBorders>
+              <w:top w:val="single" w:sz="4" w:space="0" w:color="auto"/>
+              <w:left w:val="nil"/>
+              <w:bottom w:val="single" w:sz="4" w:space="0" w:color="auto"/>
+              <w:right w:val="single" w:sz="4" w:space="0" w:color="auto"/>
+            </w:tcBorders>
+            <w:shd w:val="clear" w:color="auto" w:fill="auto"/>
+            <w:noWrap/>
+            <w:vAlign w:val="bottom"/>
+            <w:hideMark/>
+          </w:tcPr>
+          <w:p>
+            <w:pPr>
+              <w:spacing w:after="0" w:line="240" w:lineRule="auto"/>
+              <w:rPr>
+                <w:rFonts w:ascii="Arial" w:eastAsia="Times New Roman" w:hAnsi="Arial" w:cs="Arial"/>
+                <w:sz w:val="20"/>
+                <w:szCs w:val="20"/>
+              </w:rPr>
+            </w:pPr>
+            <w:r>
+              <w:rPr>
+                <w:rFonts w:ascii="Arial" w:eastAsia="Times New Roman" w:hAnsi="Arial" w:cs="Arial"/>
+                <w:sz w:val="20"/>
+                <w:szCs w:val="20"/>
+              </w:rPr>
+              <w:t>DUMP Trailer</w:t>
+            </w:r>
+          </w:p>
+        </w:tc>
+      </w:tr>
+      <w:tr>
+        <w:trPr>
+          <w:trHeight w:val="255"/>
+        </w:trPr>
+        <w:tc>
+          <w:tcPr>
+            <w:tcW w:w="735" w:type="dxa"/>
+            <w:tcBorders>
+              <w:top w:val="single" w:sz="4" w:space="0" w:color="auto"/>
+              <w:left w:val="single" w:sz="4" w:space="0" w:color="auto"/>
+              <w:bottom w:val="single" w:sz="4" w:space="0" w:color="auto"/>
+              <w:right w:val="single" w:sz="4" w:space="0" w:color="auto"/>
+            </w:tcBorders>
+            <w:shd w:val="clear" w:color="auto" w:fill="auto"/>
+            <w:noWrap/>
+            <w:vAlign w:val="bottom"/>
+            <w:hideMark/>
+          </w:tcPr>
+          <w:p>
+            <w:pPr>
+              <w:spacing w:after="0" w:line="240" w:lineRule="auto"/>
+              <w:rPr>
+                <w:rFonts w:ascii="Arial" w:eastAsia="Times New Roman" w:hAnsi="Arial" w:cs="Arial"/>
+                <w:sz w:val="20"/>
+                <w:szCs w:val="20"/>
+              </w:rPr>
+            </w:pPr>
+            <w:r>
+              <w:rPr>
+                <w:rFonts w:ascii="Arial" w:eastAsia="Times New Roman" w:hAnsi="Arial" w:cs="Arial"/>
+                <w:sz w:val="20"/>
+                <w:szCs w:val="20"/>
+              </w:rPr>
+              <w:t>E</w:t>
+            </w:r>
+          </w:p>
+        </w:tc>
+        <w:tc>
+          <w:tcPr>
+            <w:tcW w:w="2520" w:type="dxa"/>
+            <w:tcBorders>
+              <w:top w:val="single" w:sz="4" w:space="0" w:color="auto"/>
+              <w:left w:val="nil"/>
+              <w:bottom w:val="single" w:sz="4" w:space="0" w:color="auto"/>
+              <w:right w:val="single" w:sz="4" w:space="0" w:color="auto"/>
+            </w:tcBorders>
+            <w:shd w:val="clear" w:color="auto" w:fill="auto"/>
+            <w:noWrap/>
+            <w:vAlign w:val="bottom"/>
+            <w:hideMark/>
+          </w:tcPr>
+          <w:p>
+            <w:pPr>
+              <w:spacing w:after="0" w:line="240" w:lineRule="auto"/>
+              <w:rPr>
+                <w:rFonts w:ascii="Arial" w:eastAsia="Times New Roman" w:hAnsi="Arial" w:cs="Arial"/>
+                <w:sz w:val="20"/>
+                <w:szCs w:val="20"/>
+              </w:rPr>
+            </w:pPr>
+            <w:r>
+              <w:rPr>
+                <w:rFonts w:ascii="Arial" w:eastAsia="Times New Roman" w:hAnsi="Arial" w:cs="Arial"/>
+                <w:sz w:val="20"/>
+                <w:szCs w:val="20"/>
+              </w:rPr>
+              <w:t> </w:t>
+            </w:r>
+          </w:p>
+        </w:tc>
+      </w:tr>
+      <w:tr>
+        <w:trPr>
+          <w:trHeight w:val="255"/>
+        </w:trPr>
+        <w:tc>
+          <w:tcPr>
+            <w:tcW w:w="735" w:type="dxa"/>
+            <w:tcBorders>
+              <w:top w:val="single" w:sz="4" w:space="0" w:color="auto"/>
+              <w:left w:val="single" w:sz="4" w:space="0" w:color="auto"/>
+              <w:bottom w:val="single" w:sz="4" w:space="0" w:color="auto"/>
+              <w:right w:val="single" w:sz="4" w:space="0" w:color="auto"/>
+            </w:tcBorders>
+            <w:shd w:val="clear" w:color="auto" w:fill="auto"/>
+            <w:noWrap/>
+            <w:vAlign w:val="bottom"/>
+            <w:hideMark/>
+          </w:tcPr>
+          <w:p>
+            <w:pPr>
+              <w:spacing w:after="0" w:line="240" w:lineRule="auto"/>
+              <w:rPr>
+                <w:rFonts w:ascii="Arial" w:eastAsia="Times New Roman" w:hAnsi="Arial" w:cs="Arial"/>
+                <w:sz w:val="20"/>
+                <w:szCs w:val="20"/>
+              </w:rPr>
+            </w:pPr>
+            <w:r>
+              <w:rPr>
+                <w:rFonts w:ascii="Arial" w:eastAsia="Times New Roman" w:hAnsi="Arial" w:cs="Arial"/>
+                <w:sz w:val="20"/>
+                <w:szCs w:val="20"/>
+              </w:rPr>
+              <w:t>F</w:t>
+            </w:r>
+          </w:p>
+        </w:tc>
+        <w:tc>
+          <w:tcPr>
+            <w:tcW w:w="2520" w:type="dxa"/>
+            <w:tcBorders>
+              <w:top w:val="single" w:sz="4" w:space="0" w:color="auto"/>
+              <w:left w:val="nil"/>
+              <w:bottom w:val="single" w:sz="4" w:space="0" w:color="auto"/>
+              <w:right w:val="single" w:sz="4" w:space="0" w:color="auto"/>
+            </w:tcBorders>
+            <w:shd w:val="clear" w:color="auto" w:fill="auto"/>
+            <w:noWrap/>
+            <w:vAlign w:val="bottom"/>
+            <w:hideMark/>
+          </w:tcPr>
+          <w:p>
+            <w:pPr>
+              <w:spacing w:after="0" w:line="240" w:lineRule="auto"/>
+              <w:rPr>
+                <w:rFonts w:ascii="Arial" w:eastAsia="Times New Roman" w:hAnsi="Arial" w:cs="Arial"/>
+                <w:sz w:val="20"/>
+                <w:szCs w:val="20"/>
+              </w:rPr>
+            </w:pPr>
+            <w:r>
+              <w:rPr>
+                <w:rFonts w:ascii="Arial" w:eastAsia="Times New Roman" w:hAnsi="Arial" w:cs="Arial"/>
+                <w:sz w:val="20"/>
+                <w:szCs w:val="20"/>
+              </w:rPr>
+              <w:t> </w:t>
+            </w:r>
+          </w:p>
+        </w:tc>
+      </w:tr>
+      <w:tr>
+        <w:trPr>
+          <w:trHeight w:val="255"/>
+        </w:trPr>
+        <w:tc>
+          <w:tcPr>
+            <w:tcW w:w="735" w:type="dxa"/>
+            <w:tcBorders>
+              <w:top w:val="single" w:sz="4" w:space="0" w:color="auto"/>
+              <w:left w:val="single" w:sz="4" w:space="0" w:color="auto"/>
+              <w:bottom w:val="single" w:sz="4" w:space="0" w:color="auto"/>
+              <w:right w:val="single" w:sz="4" w:space="0" w:color="auto"/>
+            </w:tcBorders>
+            <w:shd w:val="clear" w:color="auto" w:fill="auto"/>
+            <w:noWrap/>
+            <w:vAlign w:val="bottom"/>
+            <w:hideMark/>
+          </w:tcPr>
+          <w:p>
+            <w:pPr>
+              <w:spacing w:after="0" w:line="240" w:lineRule="auto"/>
+              <w:rPr>
+                <w:rFonts w:ascii="Arial" w:eastAsia="Times New Roman" w:hAnsi="Arial" w:cs="Arial"/>
+                <w:sz w:val="20"/>
+                <w:szCs w:val="20"/>
+              </w:rPr>
+            </w:pPr>
+            <w:r>
+              <w:rPr>
+                <w:rFonts w:ascii="Arial" w:eastAsia="Times New Roman" w:hAnsi="Arial" w:cs="Arial"/>
+                <w:sz w:val="20"/>
+                <w:szCs w:val="20"/>
+              </w:rPr>
+              <w:t>G</w:t>
+            </w:r>
+          </w:p>
+        </w:tc>
+        <w:tc>
+          <w:tcPr>
+            <w:tcW w:w="2520" w:type="dxa"/>
+            <w:tcBorders>
+              <w:top w:val="single" w:sz="4" w:space="0" w:color="auto"/>
+              <w:left w:val="nil"/>
+              <w:bottom w:val="single" w:sz="4" w:space="0" w:color="auto"/>
+              <w:right w:val="single" w:sz="4" w:space="0" w:color="auto"/>
+            </w:tcBorders>
+            <w:shd w:val="clear" w:color="auto" w:fill="auto"/>
+            <w:noWrap/>
+            <w:vAlign w:val="bottom"/>
+            <w:hideMark/>
+          </w:tcPr>
+          <w:p>
+            <w:pPr>
+              <w:spacing w:after="0" w:line="240" w:lineRule="auto"/>
+              <w:rPr>
+                <w:rFonts w:ascii="Arial" w:eastAsia="Times New Roman" w:hAnsi="Arial" w:cs="Arial"/>
+                <w:sz w:val="20"/>
+                <w:szCs w:val="20"/>
+              </w:rPr>
+            </w:pPr>
+            <w:r>
+              <w:rPr>
+                <w:rFonts w:ascii="Arial" w:eastAsia="Times New Roman" w:hAnsi="Arial" w:cs="Arial"/>
+                <w:sz w:val="20"/>
+                <w:szCs w:val="20"/>
+              </w:rPr>
+              <w:t> </w:t>
+            </w:r>
+          </w:p>
+        </w:tc>
+      </w:tr>
+      <w:tr>
+        <w:trPr>
+          <w:trHeight w:val="255"/>
+        </w:trPr>
+        <w:tc>
+          <w:tcPr>
+            <w:tcW w:w="735" w:type="dxa"/>
+            <w:tcBorders>
+              <w:top w:val="nil"/>
+              <w:left w:val="single" w:sz="4" w:space="0" w:color="auto"/>
+              <w:bottom w:val="single" w:sz="4" w:space="0" w:color="auto"/>
+              <w:right w:val="single" w:sz="4" w:space="0" w:color="auto"/>
+            </w:tcBorders>
+            <w:shd w:val="clear" w:color="auto" w:fill="auto"/>
+            <w:noWrap/>
+            <w:vAlign w:val="bottom"/>
+            <w:hideMark/>
+          </w:tcPr>
+          <w:p>
+            <w:pPr>
+              <w:spacing w:after="0" w:line="240" w:lineRule="auto"/>
+              <w:rPr>
+                <w:rFonts w:ascii="Arial" w:eastAsia="Times New Roman" w:hAnsi="Arial" w:cs="Arial"/>
+                <w:sz w:val="20"/>
+                <w:szCs w:val="20"/>
+              </w:rPr>
+            </w:pPr>
+            <w:r>
+              <w:rPr>
+                <w:rFonts w:ascii="Arial" w:eastAsia="Times New Roman" w:hAnsi="Arial" w:cs="Arial"/>
+                <w:sz w:val="20"/>
+                <w:szCs w:val="20"/>
+              </w:rPr>
+              <w:t>H</w:t>
+            </w:r>
+          </w:p>
+        </w:tc>
+        <w:tc>
+          <w:tcPr>
+            <w:tcW w:w="2520" w:type="dxa"/>
+            <w:tcBorders>
+              <w:top w:val="nil"/>
+              <w:left w:val="nil"/>
+              <w:bottom w:val="single" w:sz="4" w:space="0" w:color="auto"/>
+              <w:right w:val="single" w:sz="4" w:space="0" w:color="auto"/>
+            </w:tcBorders>
+            <w:shd w:val="clear" w:color="auto" w:fill="auto"/>
+            <w:noWrap/>
+            <w:vAlign w:val="bottom"/>
+            <w:hideMark/>
+          </w:tcPr>
+          <w:p>
+            <w:pPr>
+              <w:spacing w:after="0" w:line="240" w:lineRule="auto"/>
+              <w:rPr>
+                <w:rFonts w:ascii="Arial" w:eastAsia="Times New Roman" w:hAnsi="Arial" w:cs="Arial"/>
+                <w:sz w:val="20"/>
+                <w:szCs w:val="20"/>
+              </w:rPr>
+            </w:pPr>
+            <w:r>
+              <w:rPr>
+                <w:rFonts w:ascii="Arial" w:eastAsia="Times New Roman" w:hAnsi="Arial" w:cs="Arial"/>
+                <w:sz w:val="20"/>
+                <w:szCs w:val="20"/>
+              </w:rPr>
+              <w:t> </w:t>
+            </w:r>
+          </w:p>
+        </w:tc>
+      </w:tr>
+      <w:tr>
+        <w:trPr>
+          <w:trHeight w:val="255"/>
+        </w:trPr>
+        <w:tc>
+          <w:tcPr>
+            <w:tcW w:w="735" w:type="dxa"/>
+            <w:tcBorders>
+              <w:top w:val="single" w:sz="4" w:space="0" w:color="auto"/>
+              <w:left w:val="single" w:sz="4" w:space="0" w:color="auto"/>
+              <w:bottom w:val="single" w:sz="4" w:space="0" w:color="auto"/>
+              <w:right w:val="single" w:sz="4" w:space="0" w:color="auto"/>
+            </w:tcBorders>
+            <w:shd w:val="clear" w:color="auto" w:fill="auto"/>
+            <w:noWrap/>
+            <w:vAlign w:val="bottom"/>
+            <w:hideMark/>
+          </w:tcPr>
+          <w:p>
+            <w:pPr>
+              <w:spacing w:after="0" w:line="240" w:lineRule="auto"/>
+              <w:rPr>
+                <w:rFonts w:ascii="Arial" w:eastAsia="Times New Roman" w:hAnsi="Arial" w:cs="Arial"/>
+                <w:sz w:val="20"/>
+                <w:szCs w:val="20"/>
+              </w:rPr>
+            </w:pPr>
+            <w:r>
+              <w:rPr>
+                <w:rFonts w:ascii="Arial" w:eastAsia="Times New Roman" w:hAnsi="Arial" w:cs="Arial"/>
+                <w:sz w:val="20"/>
+                <w:szCs w:val="20"/>
+              </w:rPr>
+              <w:t>J</w:t>
+            </w:r>
+          </w:p>
+        </w:tc>
+        <w:tc>
+          <w:tcPr>
+            <w:tcW w:w="2520" w:type="dxa"/>
+            <w:tcBorders>
+              <w:top w:val="single" w:sz="4" w:space="0" w:color="auto"/>
+              <w:left w:val="nil"/>
+              <w:bottom w:val="single" w:sz="4" w:space="0" w:color="auto"/>
+              <w:right w:val="single" w:sz="4" w:space="0" w:color="auto"/>
+            </w:tcBorders>
+            <w:shd w:val="clear" w:color="auto" w:fill="auto"/>
+            <w:noWrap/>
+            <w:vAlign w:val="bottom"/>
+            <w:hideMark/>
+          </w:tcPr>
+          <w:p>
+            <w:pPr>
+              <w:spacing w:after="0" w:line="240" w:lineRule="auto"/>
+              <w:rPr>
+                <w:rFonts w:ascii="Arial" w:eastAsia="Times New Roman" w:hAnsi="Arial" w:cs="Arial"/>
+                <w:sz w:val="20"/>
+                <w:szCs w:val="20"/>
+              </w:rPr>
+            </w:pPr>
+            <w:r>
+              <w:rPr>
+                <w:rFonts w:ascii="Arial" w:eastAsia="Times New Roman" w:hAnsi="Arial" w:cs="Arial"/>
+                <w:sz w:val="20"/>
+                <w:szCs w:val="20"/>
+              </w:rPr>
+              <w:t> </w:t>
+            </w:r>
+          </w:p>
+        </w:tc>
+      </w:tr>
+      <w:tr>
+        <w:trPr>
+          <w:trHeight w:val="255"/>
+        </w:trPr>
+        <w:tc>
+          <w:tcPr>
+            <w:tcW w:w="735" w:type="dxa"/>
+            <w:tcBorders>
+              <w:top w:val="single" w:sz="4" w:space="0" w:color="auto"/>
+              <w:left w:val="single" w:sz="4" w:space="0" w:color="auto"/>
+              <w:bottom w:val="single" w:sz="4" w:space="0" w:color="auto"/>
+              <w:right w:val="single" w:sz="4" w:space="0" w:color="auto"/>
+            </w:tcBorders>
+            <w:shd w:val="clear" w:color="auto" w:fill="auto"/>
+            <w:noWrap/>
+            <w:vAlign w:val="bottom"/>
+            <w:hideMark/>
+          </w:tcPr>
+          <w:p>
+            <w:pPr>
+              <w:spacing w:after="0" w:line="240" w:lineRule="auto"/>
+              <w:rPr>
+                <w:rFonts w:ascii="Arial" w:eastAsia="Times New Roman" w:hAnsi="Arial" w:cs="Arial"/>
+                <w:sz w:val="20"/>
+                <w:szCs w:val="20"/>
+              </w:rPr>
+            </w:pPr>
+            <w:r>
+              <w:rPr>
+                <w:rFonts w:ascii="Arial" w:eastAsia="Times New Roman" w:hAnsi="Arial" w:cs="Arial"/>
+                <w:sz w:val="20"/>
+                <w:szCs w:val="20"/>
+              </w:rPr>
+              <w:t>K</w:t>
+            </w:r>
+          </w:p>
+        </w:tc>
+        <w:tc>
+          <w:tcPr>
+            <w:tcW w:w="2520" w:type="dxa"/>
+            <w:tcBorders>
+              <w:top w:val="single" w:sz="4" w:space="0" w:color="auto"/>
+              <w:left w:val="nil"/>
+              <w:bottom w:val="single" w:sz="4" w:space="0" w:color="auto"/>
+              <w:right w:val="single" w:sz="4" w:space="0" w:color="auto"/>
+            </w:tcBorders>
+            <w:shd w:val="clear" w:color="auto" w:fill="auto"/>
+            <w:noWrap/>
+            <w:vAlign w:val="bottom"/>
+            <w:hideMark/>
+          </w:tcPr>
+          <w:p>
+            <w:pPr>
+              <w:spacing w:after="0" w:line="240" w:lineRule="auto"/>
+              <w:rPr>
+                <w:rFonts w:ascii="Arial" w:eastAsia="Times New Roman" w:hAnsi="Arial" w:cs="Arial"/>
+                <w:sz w:val="20"/>
+                <w:szCs w:val="20"/>
+              </w:rPr>
+            </w:pPr>
+            <w:r>
+              <w:rPr>
+                <w:rFonts w:ascii="Arial" w:eastAsia="Times New Roman" w:hAnsi="Arial" w:cs="Arial"/>
+                <w:sz w:val="20"/>
+                <w:szCs w:val="20"/>
+              </w:rPr>
+              <w:t> </w:t>
+            </w:r>
+          </w:p>
+        </w:tc>
+      </w:tr>
+      <w:tr>
+        <w:trPr>
+          <w:trHeight w:val="255"/>
+        </w:trPr>
+        <w:tc>
+          <w:tcPr>
+            <w:tcW w:w="735" w:type="dxa"/>
+            <w:tcBorders>
+              <w:top w:val="single" w:sz="4" w:space="0" w:color="auto"/>
+              <w:left w:val="single" w:sz="4" w:space="0" w:color="auto"/>
+              <w:bottom w:val="single" w:sz="4" w:space="0" w:color="auto"/>
+              <w:right w:val="single" w:sz="4" w:space="0" w:color="auto"/>
+            </w:tcBorders>
+            <w:shd w:val="clear" w:color="auto" w:fill="auto"/>
+            <w:noWrap/>
+            <w:vAlign w:val="bottom"/>
+            <w:hideMark/>
+          </w:tcPr>
+          <w:p>
+            <w:pPr>
+              <w:spacing w:after="0" w:line="240" w:lineRule="auto"/>
+              <w:rPr>
+                <w:rFonts w:ascii="Arial" w:eastAsia="Times New Roman" w:hAnsi="Arial" w:cs="Arial"/>
+                <w:sz w:val="20"/>
+                <w:szCs w:val="20"/>
+              </w:rPr>
+            </w:pPr>
+            <w:r>
+              <w:rPr>
+                <w:rFonts w:ascii="Arial" w:eastAsia="Times New Roman" w:hAnsi="Arial" w:cs="Arial"/>
+                <w:sz w:val="20"/>
+                <w:szCs w:val="20"/>
+              </w:rPr>
+              <w:t>L</w:t>
+            </w:r>
+          </w:p>
+        </w:tc>
+        <w:tc>
+          <w:tcPr>
+            <w:tcW w:w="2520" w:type="dxa"/>
+            <w:tcBorders>
+              <w:top w:val="single" w:sz="4" w:space="0" w:color="auto"/>
+              <w:left w:val="nil"/>
+              <w:bottom w:val="single" w:sz="4" w:space="0" w:color="auto"/>
+              <w:right w:val="single" w:sz="4" w:space="0" w:color="auto"/>
+            </w:tcBorders>
+            <w:shd w:val="clear" w:color="auto" w:fill="auto"/>
+            <w:noWrap/>
+            <w:vAlign w:val="bottom"/>
+            <w:hideMark/>
+          </w:tcPr>
+          <w:p>
+            <w:pPr>
+              <w:spacing w:after="0" w:line="240" w:lineRule="auto"/>
+              <w:rPr>
+                <w:rFonts w:ascii="Arial" w:eastAsia="Times New Roman" w:hAnsi="Arial" w:cs="Arial"/>
+                <w:sz w:val="20"/>
+                <w:szCs w:val="20"/>
+              </w:rPr>
+            </w:pPr>
+            <w:r>
+              <w:rPr>
+                <w:rFonts w:ascii="Arial" w:eastAsia="Times New Roman" w:hAnsi="Arial" w:cs="Arial"/>
+                <w:sz w:val="20"/>
+                <w:szCs w:val="20"/>
+              </w:rPr>
+              <w:t> </w:t>
+            </w:r>
+          </w:p>
+        </w:tc>
+      </w:tr>
+      <w:tr>
+        <w:trPr>
+          <w:trHeight w:val="255"/>
+        </w:trPr>
+        <w:tc>
+          <w:tcPr>
+            <w:tcW w:w="735" w:type="dxa"/>
+            <w:tcBorders>
+              <w:top w:val="nil"/>
+              <w:left w:val="single" w:sz="4" w:space="0" w:color="auto"/>
+              <w:bottom w:val="single" w:sz="4" w:space="0" w:color="auto"/>
+              <w:right w:val="single" w:sz="4" w:space="0" w:color="auto"/>
+            </w:tcBorders>
+            <w:shd w:val="clear" w:color="auto" w:fill="auto"/>
+            <w:noWrap/>
+            <w:vAlign w:val="bottom"/>
+            <w:hideMark/>
+          </w:tcPr>
+          <w:p>
+            <w:pPr>
+              <w:spacing w:after="0" w:line="240" w:lineRule="auto"/>
+              <w:rPr>
+                <w:rFonts w:ascii="Arial" w:eastAsia="Times New Roman" w:hAnsi="Arial" w:cs="Arial"/>
+                <w:sz w:val="20"/>
+                <w:szCs w:val="20"/>
+              </w:rPr>
+            </w:pPr>
+            <w:r>
+              <w:rPr>
+                <w:rFonts w:ascii="Arial" w:eastAsia="Times New Roman" w:hAnsi="Arial" w:cs="Arial"/>
+                <w:sz w:val="20"/>
+                <w:szCs w:val="20"/>
+              </w:rPr>
+              <w:t>M</w:t>
+            </w:r>
+          </w:p>
+        </w:tc>
+        <w:tc>
+          <w:tcPr>
+            <w:tcW w:w="2520" w:type="dxa"/>
+            <w:tcBorders>
+              <w:top w:val="nil"/>
+              <w:left w:val="nil"/>
+              <w:bottom w:val="single" w:sz="4" w:space="0" w:color="auto"/>
+              <w:right w:val="single" w:sz="4" w:space="0" w:color="auto"/>
+            </w:tcBorders>
+            <w:shd w:val="clear" w:color="auto" w:fill="auto"/>
+            <w:noWrap/>
+            <w:vAlign w:val="bottom"/>
+            <w:hideMark/>
+          </w:tcPr>
+          <w:p>
+            <w:pPr>
+              <w:spacing w:after="0" w:line="240" w:lineRule="auto"/>
+              <w:rPr>
+                <w:rFonts w:ascii="Arial" w:eastAsia="Times New Roman" w:hAnsi="Arial" w:cs="Arial"/>
+                <w:sz w:val="20"/>
+                <w:szCs w:val="20"/>
+              </w:rPr>
+            </w:pPr>
+            <w:r>
+              <w:rPr>
+                <w:rFonts w:ascii="Arial" w:eastAsia="Times New Roman" w:hAnsi="Arial" w:cs="Arial"/>
+                <w:sz w:val="20"/>
+                <w:szCs w:val="20"/>
+              </w:rPr>
+              <w:t> </w:t>
+            </w:r>
+          </w:p>
+        </w:tc>
+      </w:tr>
+      <w:tr>
+        <w:trPr>
+          <w:trHeight w:val="255"/>
+        </w:trPr>
+        <w:tc>
+          <w:tcPr>
+            <w:tcW w:w="735" w:type="dxa"/>
+            <w:tcBorders>
+              <w:top w:val="single" w:sz="4" w:space="0" w:color="auto"/>
+              <w:left w:val="single" w:sz="4" w:space="0" w:color="auto"/>
+              <w:bottom w:val="single" w:sz="4" w:space="0" w:color="auto"/>
+              <w:right w:val="single" w:sz="4" w:space="0" w:color="auto"/>
+            </w:tcBorders>
+            <w:shd w:val="clear" w:color="auto" w:fill="auto"/>
+            <w:noWrap/>
+            <w:vAlign w:val="bottom"/>
+            <w:hideMark/>
+          </w:tcPr>
+          <w:p>
+            <w:pPr>
+              <w:spacing w:after="0" w:line="240" w:lineRule="auto"/>
+              <w:rPr>
+                <w:rFonts w:ascii="Arial" w:eastAsia="Times New Roman" w:hAnsi="Arial" w:cs="Arial"/>
+                <w:sz w:val="20"/>
+                <w:szCs w:val="20"/>
+              </w:rPr>
+            </w:pPr>
+            <w:r>
+              <w:rPr>
+                <w:rFonts w:ascii="Arial" w:eastAsia="Times New Roman" w:hAnsi="Arial" w:cs="Arial"/>
+                <w:sz w:val="20"/>
+                <w:szCs w:val="20"/>
+              </w:rPr>
+              <w:t>N</w:t>
+            </w:r>
+          </w:p>
+        </w:tc>
+        <w:tc>
+          <w:tcPr>
+            <w:tcW w:w="2520" w:type="dxa"/>
+            <w:tcBorders>
+              <w:top w:val="single" w:sz="4" w:space="0" w:color="auto"/>
+              <w:left w:val="nil"/>
+              <w:bottom w:val="single" w:sz="4" w:space="0" w:color="auto"/>
+              <w:right w:val="single" w:sz="4" w:space="0" w:color="auto"/>
+            </w:tcBorders>
+            <w:shd w:val="clear" w:color="auto" w:fill="auto"/>
+            <w:noWrap/>
+            <w:vAlign w:val="bottom"/>
+            <w:hideMark/>
+          </w:tcPr>
+          <w:p>
+            <w:pPr>
+              <w:spacing w:after="0" w:line="240" w:lineRule="auto"/>
+              <w:rPr>
+                <w:rFonts w:ascii="Arial" w:eastAsia="Times New Roman" w:hAnsi="Arial" w:cs="Arial"/>
+                <w:sz w:val="20"/>
+                <w:szCs w:val="20"/>
+              </w:rPr>
+            </w:pPr>
+            <w:r>
+              <w:rPr>
+                <w:rFonts w:ascii="Arial" w:eastAsia="Times New Roman" w:hAnsi="Arial" w:cs="Arial"/>
+                <w:sz w:val="20"/>
+                <w:szCs w:val="20"/>
+              </w:rPr>
+              <w:t> </w:t>
+            </w:r>
+          </w:p>
+        </w:tc>
+      </w:tr>
+      <w:tr>
+        <w:trPr>
+          <w:trHeight w:val="255"/>
+        </w:trPr>
+        <w:tc>
+          <w:tcPr>
+            <w:tcW w:w="735" w:type="dxa"/>
+            <w:tcBorders>
+              <w:top w:val="single" w:sz="4" w:space="0" w:color="auto"/>
+              <w:left w:val="single" w:sz="4" w:space="0" w:color="auto"/>
+              <w:bottom w:val="single" w:sz="4" w:space="0" w:color="auto"/>
+              <w:right w:val="single" w:sz="4" w:space="0" w:color="auto"/>
+            </w:tcBorders>
+            <w:shd w:val="clear" w:color="auto" w:fill="auto"/>
+            <w:noWrap/>
+            <w:vAlign w:val="bottom"/>
+            <w:hideMark/>
+          </w:tcPr>
+          <w:p>
+            <w:pPr>
+              <w:spacing w:after="0" w:line="240" w:lineRule="auto"/>
+              <w:rPr>
+                <w:rFonts w:ascii="Arial" w:eastAsia="Times New Roman" w:hAnsi="Arial" w:cs="Arial"/>
+                <w:sz w:val="20"/>
+                <w:szCs w:val="20"/>
+              </w:rPr>
+            </w:pPr>
+            <w:r>
+              <w:rPr>
+                <w:rFonts w:ascii="Arial" w:eastAsia="Times New Roman" w:hAnsi="Arial" w:cs="Arial"/>
+                <w:sz w:val="20"/>
+                <w:szCs w:val="20"/>
+              </w:rPr>
+              <w:t>P</w:t>
+            </w:r>
+          </w:p>
+        </w:tc>
+        <w:tc>
+          <w:tcPr>
+            <w:tcW w:w="2520" w:type="dxa"/>
+            <w:tcBorders>
+              <w:top w:val="single" w:sz="4" w:space="0" w:color="auto"/>
+              <w:left w:val="nil"/>
+              <w:bottom w:val="single" w:sz="4" w:space="0" w:color="auto"/>
+              <w:right w:val="single" w:sz="4" w:space="0" w:color="auto"/>
+            </w:tcBorders>
+            <w:shd w:val="clear" w:color="auto" w:fill="auto"/>
+            <w:noWrap/>
+            <w:vAlign w:val="bottom"/>
+            <w:hideMark/>
+          </w:tcPr>
+          <w:p>
+            <w:pPr>
+              <w:spacing w:after="0" w:line="240" w:lineRule="auto"/>
+              <w:rPr>
+                <w:rFonts w:ascii="Arial" w:eastAsia="Times New Roman" w:hAnsi="Arial" w:cs="Arial"/>
+                <w:sz w:val="20"/>
+                <w:szCs w:val="20"/>
+              </w:rPr>
+            </w:pPr>
+            <w:r>
+              <w:rPr>
+                <w:rFonts w:ascii="Arial" w:eastAsia="Times New Roman" w:hAnsi="Arial" w:cs="Arial"/>
+                <w:sz w:val="20"/>
+                <w:szCs w:val="20"/>
+              </w:rPr>
+              <w:t>PONY Trailer</w:t>
+            </w:r>
+          </w:p>
+        </w:tc>
+      </w:tr>
+      <w:tr>
+        <w:trPr>
+          <w:trHeight w:val="255"/>
+        </w:trPr>
+        <w:tc>
+          <w:tcPr>
+            <w:tcW w:w="735" w:type="dxa"/>
+            <w:tcBorders>
+              <w:top w:val="single" w:sz="4" w:space="0" w:color="auto"/>
+              <w:left w:val="single" w:sz="4" w:space="0" w:color="auto"/>
+              <w:bottom w:val="single" w:sz="4" w:space="0" w:color="auto"/>
+              <w:right w:val="single" w:sz="4" w:space="0" w:color="auto"/>
+            </w:tcBorders>
+            <w:shd w:val="clear" w:color="auto" w:fill="auto"/>
+            <w:noWrap/>
+            <w:vAlign w:val="bottom"/>
+            <w:hideMark/>
+          </w:tcPr>
+          <w:p>
+            <w:pPr>
+              <w:spacing w:after="0" w:line="240" w:lineRule="auto"/>
+              <w:rPr>
+                <w:rFonts w:ascii="Arial" w:eastAsia="Times New Roman" w:hAnsi="Arial" w:cs="Arial"/>
+                <w:sz w:val="20"/>
+                <w:szCs w:val="20"/>
+              </w:rPr>
+            </w:pPr>
+            <w:r>
+              <w:rPr>
+                <w:rFonts w:ascii="Arial" w:eastAsia="Times New Roman" w:hAnsi="Arial" w:cs="Arial"/>
+                <w:sz w:val="20"/>
+                <w:szCs w:val="20"/>
+              </w:rPr>
+              <w:t>R</w:t>
+            </w:r>
+          </w:p>
+        </w:tc>
+        <w:tc>
+          <w:tcPr>
+            <w:tcW w:w="2520" w:type="dxa"/>
+            <w:tcBorders>
+              <w:top w:val="single" w:sz="4" w:space="0" w:color="auto"/>
+              <w:left w:val="nil"/>
+              <w:bottom w:val="single" w:sz="4" w:space="0" w:color="auto"/>
+              <w:right w:val="single" w:sz="4" w:space="0" w:color="auto"/>
+            </w:tcBorders>
+            <w:shd w:val="clear" w:color="auto" w:fill="auto"/>
+            <w:noWrap/>
+            <w:vAlign w:val="bottom"/>
+            <w:hideMark/>
+          </w:tcPr>
+          <w:p>
+            <w:pPr>
+              <w:spacing w:after="0" w:line="240" w:lineRule="auto"/>
+              <w:rPr>
+                <w:rFonts w:ascii="Arial" w:eastAsia="Times New Roman" w:hAnsi="Arial" w:cs="Arial"/>
+                <w:sz w:val="20"/>
+                <w:szCs w:val="20"/>
+              </w:rPr>
+            </w:pPr>
+            <w:r>
+              <w:rPr>
+                <w:rFonts w:ascii="Arial" w:eastAsia="Times New Roman" w:hAnsi="Arial" w:cs="Arial"/>
+                <w:sz w:val="20"/>
+                <w:szCs w:val="20"/>
+              </w:rPr>
+              <w:t> </w:t>
+            </w:r>
+          </w:p>
+        </w:tc>
+      </w:tr>
+      <w:tr>
+        <w:trPr>
+          <w:trHeight w:val="255"/>
+        </w:trPr>
+        <w:tc>
+          <w:tcPr>
+            <w:tcW w:w="735" w:type="dxa"/>
+            <w:tcBorders>
+              <w:top w:val="single" w:sz="4" w:space="0" w:color="auto"/>
+              <w:left w:val="single" w:sz="4" w:space="0" w:color="auto"/>
+              <w:bottom w:val="single" w:sz="4" w:space="0" w:color="auto"/>
+              <w:right w:val="single" w:sz="4" w:space="0" w:color="auto"/>
+            </w:tcBorders>
+            <w:shd w:val="clear" w:color="auto" w:fill="auto"/>
+            <w:noWrap/>
+            <w:vAlign w:val="bottom"/>
+            <w:hideMark/>
+          </w:tcPr>
+          <w:p>
+            <w:pPr>
+              <w:spacing w:after="0" w:line="240" w:lineRule="auto"/>
+              <w:rPr>
+                <w:rFonts w:ascii="Arial" w:eastAsia="Times New Roman" w:hAnsi="Arial" w:cs="Arial"/>
+                <w:sz w:val="20"/>
+                <w:szCs w:val="20"/>
+              </w:rPr>
+            </w:pPr>
+            <w:r>
+              <w:rPr>
+                <w:rFonts w:ascii="Arial" w:eastAsia="Times New Roman" w:hAnsi="Arial" w:cs="Arial"/>
+                <w:sz w:val="20"/>
+                <w:szCs w:val="20"/>
+              </w:rPr>
+              <w:t>S</w:t>
+            </w:r>
+          </w:p>
+        </w:tc>
+        <w:tc>
+          <w:tcPr>
+            <w:tcW w:w="2520" w:type="dxa"/>
+            <w:tcBorders>
+              <w:top w:val="single" w:sz="4" w:space="0" w:color="auto"/>
+              <w:left w:val="nil"/>
+              <w:bottom w:val="single" w:sz="4" w:space="0" w:color="auto"/>
+              <w:right w:val="single" w:sz="4" w:space="0" w:color="auto"/>
+            </w:tcBorders>
+            <w:shd w:val="clear" w:color="auto" w:fill="auto"/>
+            <w:noWrap/>
+            <w:vAlign w:val="bottom"/>
+            <w:hideMark/>
+          </w:tcPr>
+          <w:p>
+            <w:pPr>
+              <w:spacing w:after="0" w:line="240" w:lineRule="auto"/>
+              <w:rPr>
+                <w:rFonts w:ascii="Arial" w:eastAsia="Times New Roman" w:hAnsi="Arial" w:cs="Arial"/>
+                <w:sz w:val="20"/>
+                <w:szCs w:val="20"/>
+              </w:rPr>
+            </w:pPr>
+            <w:r>
+              <w:rPr>
+                <w:rFonts w:ascii="Arial" w:eastAsia="Times New Roman" w:hAnsi="Arial" w:cs="Arial"/>
+                <w:sz w:val="20"/>
+                <w:szCs w:val="20"/>
+              </w:rPr>
+              <w:t> </w:t>
+            </w:r>
+          </w:p>
+        </w:tc>
+      </w:tr>
+      <w:tr>
+        <w:trPr>
+          <w:trHeight w:val="255"/>
+        </w:trPr>
+        <w:tc>
+          <w:tcPr>
+            <w:tcW w:w="735" w:type="dxa"/>
+            <w:tcBorders>
+              <w:top w:val="nil"/>
+              <w:left w:val="single" w:sz="4" w:space="0" w:color="auto"/>
+              <w:bottom w:val="single" w:sz="4" w:space="0" w:color="auto"/>
+              <w:right w:val="single" w:sz="4" w:space="0" w:color="auto"/>
+            </w:tcBorders>
+            <w:shd w:val="clear" w:color="auto" w:fill="auto"/>
+            <w:noWrap/>
+            <w:vAlign w:val="bottom"/>
+            <w:hideMark/>
+          </w:tcPr>
+          <w:p>
+            <w:pPr>
+              <w:spacing w:after="0" w:line="240" w:lineRule="auto"/>
+              <w:rPr>
+                <w:rFonts w:ascii="Arial" w:eastAsia="Times New Roman" w:hAnsi="Arial" w:cs="Arial"/>
+                <w:sz w:val="20"/>
+                <w:szCs w:val="20"/>
+              </w:rPr>
+            </w:pPr>
+            <w:r>
+              <w:rPr>
+                <w:rFonts w:ascii="Arial" w:eastAsia="Times New Roman" w:hAnsi="Arial" w:cs="Arial"/>
+                <w:sz w:val="20"/>
+                <w:szCs w:val="20"/>
+              </w:rPr>
+              <w:t>T</w:t>
+            </w:r>
+          </w:p>
+        </w:tc>
+        <w:tc>
+          <w:tcPr>
+            <w:tcW w:w="2520" w:type="dxa"/>
+            <w:tcBorders>
+              <w:top w:val="nil"/>
+              <w:left w:val="nil"/>
+              <w:bottom w:val="single" w:sz="4" w:space="0" w:color="auto"/>
+              <w:right w:val="single" w:sz="4" w:space="0" w:color="auto"/>
+            </w:tcBorders>
+            <w:shd w:val="clear" w:color="auto" w:fill="auto"/>
+            <w:noWrap/>
+            <w:vAlign w:val="bottom"/>
+            <w:hideMark/>
+          </w:tcPr>
+          <w:p>
+            <w:pPr>
+              <w:spacing w:after="0" w:line="240" w:lineRule="auto"/>
+              <w:rPr>
+                <w:rFonts w:ascii="Arial" w:eastAsia="Times New Roman" w:hAnsi="Arial" w:cs="Arial"/>
+                <w:sz w:val="20"/>
+                <w:szCs w:val="20"/>
+              </w:rPr>
+            </w:pPr>
+            <w:r>
+              <w:rPr>
+                <w:rFonts w:ascii="Arial" w:eastAsia="Times New Roman" w:hAnsi="Arial" w:cs="Arial"/>
+                <w:sz w:val="20"/>
+                <w:szCs w:val="20"/>
+              </w:rPr>
+              <w:t> </w:t>
+            </w:r>
+          </w:p>
+        </w:tc>
+      </w:tr>
+      <w:tr>
+        <w:trPr>
+          <w:trHeight w:val="255"/>
+        </w:trPr>
+        <w:tc>
+          <w:tcPr>
+            <w:tcW w:w="735" w:type="dxa"/>
+            <w:tcBorders>
+              <w:top w:val="single" w:sz="4" w:space="0" w:color="auto"/>
+              <w:left w:val="single" w:sz="4" w:space="0" w:color="auto"/>
+              <w:bottom w:val="single" w:sz="4" w:space="0" w:color="auto"/>
+              <w:right w:val="single" w:sz="4" w:space="0" w:color="auto"/>
+            </w:tcBorders>
+            <w:shd w:val="clear" w:color="auto" w:fill="auto"/>
+            <w:noWrap/>
+            <w:vAlign w:val="bottom"/>
+            <w:hideMark/>
+          </w:tcPr>
+          <w:p>
+            <w:pPr>
+              <w:spacing w:after="0" w:line="240" w:lineRule="auto"/>
+              <w:rPr>
+                <w:rFonts w:ascii="Arial" w:eastAsia="Times New Roman" w:hAnsi="Arial" w:cs="Arial"/>
+                <w:sz w:val="20"/>
+                <w:szCs w:val="20"/>
+              </w:rPr>
+            </w:pPr>
+            <w:r>
+              <w:rPr>
+                <w:rFonts w:ascii="Arial" w:eastAsia="Times New Roman" w:hAnsi="Arial" w:cs="Arial"/>
+                <w:sz w:val="20"/>
+                <w:szCs w:val="20"/>
+              </w:rPr>
+              <w:t>U</w:t>
+            </w:r>
+          </w:p>
+        </w:tc>
+        <w:tc>
+          <w:tcPr>
+            <w:tcW w:w="2520" w:type="dxa"/>
+            <w:tcBorders>
+              <w:top w:val="single" w:sz="4" w:space="0" w:color="auto"/>
+              <w:left w:val="nil"/>
+              <w:bottom w:val="single" w:sz="4" w:space="0" w:color="auto"/>
+              <w:right w:val="single" w:sz="4" w:space="0" w:color="auto"/>
+            </w:tcBorders>
+            <w:shd w:val="clear" w:color="auto" w:fill="auto"/>
+            <w:noWrap/>
+            <w:vAlign w:val="bottom"/>
+            <w:hideMark/>
+          </w:tcPr>
+          <w:p>
+            <w:pPr>
+              <w:spacing w:after="0" w:line="240" w:lineRule="auto"/>
+              <w:rPr>
+                <w:rFonts w:ascii="Arial" w:eastAsia="Times New Roman" w:hAnsi="Arial" w:cs="Arial"/>
+                <w:sz w:val="20"/>
+                <w:szCs w:val="20"/>
+              </w:rPr>
+            </w:pPr>
+            <w:r>
+              <w:rPr>
+                <w:rFonts w:ascii="Arial" w:eastAsia="Times New Roman" w:hAnsi="Arial" w:cs="Arial"/>
+                <w:sz w:val="20"/>
+                <w:szCs w:val="20"/>
+              </w:rPr>
+              <w:t> </w:t>
+            </w:r>
+          </w:p>
+        </w:tc>
+      </w:tr>
+      <w:tr>
+        <w:trPr>
+          <w:trHeight w:val="255"/>
+        </w:trPr>
+        <w:tc>
+          <w:tcPr>
+            <w:tcW w:w="735" w:type="dxa"/>
+            <w:tcBorders>
+              <w:top w:val="single" w:sz="4" w:space="0" w:color="auto"/>
+              <w:left w:val="single" w:sz="4" w:space="0" w:color="auto"/>
+              <w:bottom w:val="single" w:sz="4" w:space="0" w:color="auto"/>
+              <w:right w:val="single" w:sz="4" w:space="0" w:color="auto"/>
+            </w:tcBorders>
+            <w:shd w:val="clear" w:color="auto" w:fill="auto"/>
+            <w:noWrap/>
+            <w:vAlign w:val="bottom"/>
+            <w:hideMark/>
+          </w:tcPr>
+          <w:p>
+            <w:pPr>
+              <w:spacing w:after="0" w:line="240" w:lineRule="auto"/>
+              <w:rPr>
+                <w:rFonts w:ascii="Arial" w:eastAsia="Times New Roman" w:hAnsi="Arial" w:cs="Arial"/>
+                <w:sz w:val="20"/>
+                <w:szCs w:val="20"/>
+              </w:rPr>
+            </w:pPr>
+            <w:r>
+              <w:rPr>
+                <w:rFonts w:ascii="Arial" w:eastAsia="Times New Roman" w:hAnsi="Arial" w:cs="Arial"/>
+                <w:sz w:val="20"/>
+                <w:szCs w:val="20"/>
+              </w:rPr>
+              <w:t>V</w:t>
+            </w:r>
+          </w:p>
+        </w:tc>
+        <w:tc>
+          <w:tcPr>
+            <w:tcW w:w="2520" w:type="dxa"/>
+            <w:tcBorders>
+              <w:top w:val="single" w:sz="4" w:space="0" w:color="auto"/>
+              <w:left w:val="nil"/>
+              <w:bottom w:val="single" w:sz="4" w:space="0" w:color="auto"/>
+              <w:right w:val="single" w:sz="4" w:space="0" w:color="auto"/>
+            </w:tcBorders>
+            <w:shd w:val="clear" w:color="auto" w:fill="auto"/>
+            <w:noWrap/>
+            <w:vAlign w:val="bottom"/>
+            <w:hideMark/>
+          </w:tcPr>
+          <w:p>
+            <w:pPr>
+              <w:spacing w:after="0" w:line="240" w:lineRule="auto"/>
+              <w:rPr>
+                <w:rFonts w:ascii="Arial" w:eastAsia="Times New Roman" w:hAnsi="Arial" w:cs="Arial"/>
+                <w:sz w:val="20"/>
+                <w:szCs w:val="20"/>
+              </w:rPr>
+            </w:pPr>
+            <w:r>
+              <w:rPr>
+                <w:rFonts w:ascii="Arial" w:eastAsia="Times New Roman" w:hAnsi="Arial" w:cs="Arial"/>
+                <w:sz w:val="20"/>
+                <w:szCs w:val="20"/>
+              </w:rPr>
+              <w:t> </w:t>
+            </w:r>
+          </w:p>
+        </w:tc>
+      </w:tr>
+      <w:tr>
+        <w:trPr>
+          <w:trHeight w:val="255"/>
+        </w:trPr>
+        <w:tc>
+          <w:tcPr>
+            <w:tcW w:w="735" w:type="dxa"/>
+            <w:tcBorders>
+              <w:top w:val="single" w:sz="4" w:space="0" w:color="auto"/>
+              <w:left w:val="single" w:sz="4" w:space="0" w:color="auto"/>
+              <w:bottom w:val="single" w:sz="4" w:space="0" w:color="auto"/>
+              <w:right w:val="single" w:sz="4" w:space="0" w:color="auto"/>
+            </w:tcBorders>
+            <w:shd w:val="clear" w:color="auto" w:fill="auto"/>
+            <w:noWrap/>
+            <w:vAlign w:val="bottom"/>
+            <w:hideMark/>
+          </w:tcPr>
+          <w:p>
+            <w:pPr>
+              <w:spacing w:after="0" w:line="240" w:lineRule="auto"/>
+              <w:rPr>
+                <w:rFonts w:ascii="Arial" w:eastAsia="Times New Roman" w:hAnsi="Arial" w:cs="Arial"/>
+                <w:sz w:val="20"/>
+                <w:szCs w:val="20"/>
+              </w:rPr>
+            </w:pPr>
+            <w:r>
+              <w:rPr>
+                <w:rFonts w:ascii="Arial" w:eastAsia="Times New Roman" w:hAnsi="Arial" w:cs="Arial"/>
+                <w:sz w:val="20"/>
+                <w:szCs w:val="20"/>
+              </w:rPr>
+              <w:t>W</w:t>
+            </w:r>
+          </w:p>
+        </w:tc>
+        <w:tc>
+          <w:tcPr>
+            <w:tcW w:w="2520" w:type="dxa"/>
+            <w:tcBorders>
+              <w:top w:val="single" w:sz="4" w:space="0" w:color="auto"/>
+              <w:left w:val="nil"/>
+              <w:bottom w:val="single" w:sz="4" w:space="0" w:color="auto"/>
+              <w:right w:val="single" w:sz="4" w:space="0" w:color="auto"/>
+            </w:tcBorders>
+            <w:shd w:val="clear" w:color="auto" w:fill="auto"/>
+            <w:noWrap/>
+            <w:vAlign w:val="bottom"/>
+            <w:hideMark/>
+          </w:tcPr>
+          <w:p>
+            <w:pPr>
+              <w:spacing w:after="0" w:line="240" w:lineRule="auto"/>
+              <w:rPr>
+                <w:rFonts w:ascii="Arial" w:eastAsia="Times New Roman" w:hAnsi="Arial" w:cs="Arial"/>
+                <w:sz w:val="20"/>
+                <w:szCs w:val="20"/>
+              </w:rPr>
+            </w:pPr>
+            <w:r>
+              <w:rPr>
+                <w:rFonts w:ascii="Arial" w:eastAsia="Times New Roman" w:hAnsi="Arial" w:cs="Arial"/>
+                <w:sz w:val="20"/>
+                <w:szCs w:val="20"/>
+              </w:rPr>
+              <w:t> </w:t>
+            </w:r>
+          </w:p>
+        </w:tc>
+      </w:tr>
+      <w:tr>
+        <w:trPr>
+          <w:trHeight w:val="255"/>
+        </w:trPr>
+        <w:tc>
+          <w:tcPr>
+            <w:tcW w:w="735" w:type="dxa"/>
+            <w:tcBorders>
+              <w:top w:val="single" w:sz="4" w:space="0" w:color="auto"/>
+              <w:left w:val="single" w:sz="4" w:space="0" w:color="auto"/>
+              <w:bottom w:val="single" w:sz="4" w:space="0" w:color="auto"/>
+              <w:right w:val="single" w:sz="4" w:space="0" w:color="auto"/>
+            </w:tcBorders>
+            <w:shd w:val="clear" w:color="auto" w:fill="auto"/>
+            <w:noWrap/>
+            <w:vAlign w:val="bottom"/>
+            <w:hideMark/>
+          </w:tcPr>
+          <w:p>
+            <w:pPr>
+              <w:spacing w:after="0" w:line="240" w:lineRule="auto"/>
+              <w:rPr>
+                <w:rFonts w:ascii="Arial" w:eastAsia="Times New Roman" w:hAnsi="Arial" w:cs="Arial"/>
+                <w:sz w:val="20"/>
+                <w:szCs w:val="20"/>
+              </w:rPr>
+            </w:pPr>
+            <w:r>
+              <w:rPr>
+                <w:rFonts w:ascii="Arial" w:eastAsia="Times New Roman" w:hAnsi="Arial" w:cs="Arial"/>
+                <w:sz w:val="20"/>
+                <w:szCs w:val="20"/>
+              </w:rPr>
+              <w:t>X</w:t>
+            </w:r>
+          </w:p>
+        </w:tc>
+        <w:tc>
+          <w:tcPr>
+            <w:tcW w:w="2520" w:type="dxa"/>
+            <w:tcBorders>
+              <w:top w:val="single" w:sz="4" w:space="0" w:color="auto"/>
+              <w:left w:val="nil"/>
+              <w:bottom w:val="single" w:sz="4" w:space="0" w:color="auto"/>
+              <w:right w:val="single" w:sz="4" w:space="0" w:color="auto"/>
+            </w:tcBorders>
+            <w:shd w:val="clear" w:color="auto" w:fill="auto"/>
+            <w:noWrap/>
+            <w:vAlign w:val="bottom"/>
+            <w:hideMark/>
+          </w:tcPr>
+          <w:p>
+            <w:pPr>
+              <w:spacing w:after="0" w:line="240" w:lineRule="auto"/>
+              <w:rPr>
+                <w:rFonts w:ascii="Arial" w:eastAsia="Times New Roman" w:hAnsi="Arial" w:cs="Arial"/>
+                <w:sz w:val="20"/>
+                <w:szCs w:val="20"/>
+              </w:rPr>
+            </w:pPr>
+            <w:r>
+              <w:rPr>
+                <w:rFonts w:ascii="Arial" w:eastAsia="Times New Roman" w:hAnsi="Arial" w:cs="Arial"/>
+                <w:sz w:val="20"/>
+                <w:szCs w:val="20"/>
+              </w:rPr>
+              <w:t> </w:t>
+            </w:r>
+          </w:p>
+        </w:tc>
+      </w:tr>
+      <w:tr>
+        <w:trPr>
+          <w:trHeight w:val="270"/>
+        </w:trPr>
+        <w:tc>
+          <w:tcPr>
+            <w:tcW w:w="735" w:type="dxa"/>
+            <w:tcBorders>
+              <w:top w:val="nil"/>
+              <w:left w:val="single" w:sz="4" w:space="0" w:color="auto"/>
+              <w:bottom w:val="single" w:sz="4" w:space="0" w:color="auto"/>
+              <w:right w:val="nil"/>
+            </w:tcBorders>
+            <w:shd w:val="clear" w:color="auto" w:fill="auto"/>
+            <w:noWrap/>
+            <w:vAlign w:val="bottom"/>
+            <w:hideMark/>
+          </w:tcPr>
+          <w:p>
+            <w:pPr>
+              <w:spacing w:after="0" w:line="240" w:lineRule="auto"/>
+              <w:rPr>
+                <w:rFonts w:ascii="Arial" w:eastAsia="Times New Roman" w:hAnsi="Arial" w:cs="Arial"/>
+                <w:sz w:val="20"/>
+                <w:szCs w:val="20"/>
+              </w:rPr>
+            </w:pPr>
+            <w:r>
+              <w:rPr>
+                <w:rFonts w:ascii="Arial" w:eastAsia="Times New Roman" w:hAnsi="Arial" w:cs="Arial"/>
+                <w:sz w:val="20"/>
+                <w:szCs w:val="20"/>
+              </w:rPr>
+              <w:t>Y</w:t>
+            </w:r>
+          </w:p>
+        </w:tc>
+        <w:tc>
+          <w:tcPr>
+            <w:tcW w:w="2520" w:type="dxa"/>
+            <w:tcBorders>
+              <w:top w:val="nil"/>
+              <w:left w:val="single" w:sz="4" w:space="0" w:color="auto"/>
+              <w:bottom w:val="single" w:sz="4" w:space="0" w:color="auto"/>
+              <w:right w:val="single" w:sz="4" w:space="0" w:color="auto"/>
+            </w:tcBorders>
+            <w:shd w:val="clear" w:color="auto" w:fill="auto"/>
+            <w:noWrap/>
+            <w:vAlign w:val="bottom"/>
+            <w:hideMark/>
+          </w:tcPr>
+          <w:p>
+            <w:pPr>
+              <w:spacing w:after="0" w:line="240" w:lineRule="auto"/>
+              <w:rPr>
+                <w:rFonts w:ascii="Arial" w:eastAsia="Times New Roman" w:hAnsi="Arial" w:cs="Arial"/>
+                <w:sz w:val="20"/>
+                <w:szCs w:val="20"/>
+              </w:rPr>
+            </w:pPr>
+            <w:r>
+              <w:rPr>
+                <w:rFonts w:ascii="Arial" w:eastAsia="Times New Roman" w:hAnsi="Arial" w:cs="Arial"/>
+                <w:sz w:val="20"/>
+                <w:szCs w:val="20"/>
+              </w:rPr>
+              <w:t> </w:t>
+            </w:r>
+          </w:p>
+        </w:tc>
+      </w:tr>
+      <w:tr>
+        <w:trPr>
+          <w:trHeight w:val="255"/>
+        </w:trPr>
+        <w:tc>
+          <w:tcPr>
+            <w:tcW w:w="735" w:type="dxa"/>
+            <w:tcBorders>
+              <w:top w:val="single" w:sz="4" w:space="0" w:color="auto"/>
+              <w:left w:val="single" w:sz="4" w:space="0" w:color="auto"/>
+              <w:bottom w:val="single" w:sz="4" w:space="0" w:color="auto"/>
+              <w:right w:val="single" w:sz="4" w:space="0" w:color="auto"/>
+            </w:tcBorders>
+            <w:shd w:val="clear" w:color="auto" w:fill="auto"/>
+            <w:noWrap/>
+            <w:vAlign w:val="bottom"/>
+            <w:hideMark/>
+          </w:tcPr>
+          <w:p>
+            <w:pPr>
+              <w:spacing w:after="0" w:line="240" w:lineRule="auto"/>
+              <w:rPr>
+                <w:rFonts w:ascii="Arial" w:eastAsia="Times New Roman" w:hAnsi="Arial" w:cs="Arial"/>
+                <w:sz w:val="20"/>
+                <w:szCs w:val="20"/>
+              </w:rPr>
+            </w:pPr>
+            <w:r>
+              <w:rPr>
+                <w:rFonts w:ascii="Arial" w:eastAsia="Times New Roman" w:hAnsi="Arial" w:cs="Arial"/>
+                <w:sz w:val="20"/>
+                <w:szCs w:val="20"/>
+              </w:rPr>
+              <w:t>Z</w:t>
+            </w:r>
+          </w:p>
+        </w:tc>
+        <w:tc>
+          <w:tcPr>
+            <w:tcW w:w="2520" w:type="dxa"/>
+            <w:tcBorders>
+              <w:top w:val="single" w:sz="4" w:space="0" w:color="auto"/>
+              <w:left w:val="nil"/>
+              <w:bottom w:val="single" w:sz="4" w:space="0" w:color="auto"/>
+              <w:right w:val="single" w:sz="4" w:space="0" w:color="auto"/>
+            </w:tcBorders>
+            <w:shd w:val="clear" w:color="auto" w:fill="auto"/>
+            <w:noWrap/>
+            <w:vAlign w:val="bottom"/>
+            <w:hideMark/>
+          </w:tcPr>
+          <w:p>
+            <w:pPr>
+              <w:spacing w:after="0" w:line="240" w:lineRule="auto"/>
+              <w:rPr>
+                <w:rFonts w:ascii="Arial" w:eastAsia="Times New Roman" w:hAnsi="Arial" w:cs="Arial"/>
+                <w:sz w:val="20"/>
+                <w:szCs w:val="20"/>
+              </w:rPr>
+            </w:pPr>
+            <w:r>
+              <w:rPr>
+                <w:rFonts w:ascii="Arial" w:eastAsia="Times New Roman" w:hAnsi="Arial" w:cs="Arial"/>
+                <w:sz w:val="20"/>
+                <w:szCs w:val="20"/>
+              </w:rPr>
+              <w:t>CONVERTER Dolly</w:t>
+            </w:r>
+          </w:p>
+        </w:tc>
+      </w:tr>
+    </w:tbl>
+    <w:p/>
     <w:p/>
     <w:sectPr>
       <w:pgSz w:w="12240" w:h="15840"/>
@@ -2180,6 +4540,36 @@
         <w:right w:w="108" w:type="dxa"/>
       </w:tblCellMar>
     </w:tblPr>
+  </w:style>
+  <w:style w:type="paragraph" w:styleId="BalloonText">
+    <w:name w:val="Balloon Text"/>
+    <w:basedOn w:val="Normal"/>
+    <w:link w:val="BalloonTextChar"/>
+    <w:uiPriority w:val="99"/>
+    <w:semiHidden/>
+    <w:unhideWhenUsed/>
+    <w:rsid w:val="00FD6AB9"/>
+    <w:pPr>
+      <w:spacing w:after="0" w:line="240" w:lineRule="auto"/>
+    </w:pPr>
+    <w:rPr>
+      <w:rFonts w:ascii="Tahoma" w:hAnsi="Tahoma" w:cs="Tahoma"/>
+      <w:sz w:val="16"/>
+      <w:szCs w:val="16"/>
+    </w:rPr>
+  </w:style>
+  <w:style w:type="character" w:customStyle="1" w:styleId="BalloonTextChar">
+    <w:name w:val="Balloon Text Char"/>
+    <w:basedOn w:val="DefaultParagraphFont"/>
+    <w:link w:val="BalloonText"/>
+    <w:uiPriority w:val="99"/>
+    <w:semiHidden/>
+    <w:rsid w:val="00FD6AB9"/>
+    <w:rPr>
+      <w:rFonts w:ascii="Tahoma" w:hAnsi="Tahoma" w:cs="Tahoma"/>
+      <w:sz w:val="16"/>
+      <w:szCs w:val="16"/>
+    </w:rPr>
   </w:style>
 </w:styles>
 </file>
@@ -2484,7 +4874,7 @@
 </file>
 
 <file path=customXml/itemProps1.xml><?xml version="1.0" encoding="utf-8"?>
-<ds:datastoreItem xmlns:ds="http://schemas.openxmlformats.org/officeDocument/2006/customXml" ds:itemID="{C42B3B4E-8FA8-4BDA-976B-D15BF3662B4A}">
+<ds:datastoreItem xmlns:ds="http://schemas.openxmlformats.org/officeDocument/2006/customXml" ds:itemID="{70330A3F-2BD4-4738-8885-EFE1619F1FDF}">
   <ds:schemaRefs>
     <ds:schemaRef ds:uri="http://schemas.openxmlformats.org/officeDocument/2006/bibliography"/>
   </ds:schemaRefs>

</xml_diff>